<commit_message>
Ajout de la catégorie administrateur + page de statistiques du site pour admin (Exo d'entrainement gardé pour le site)
</commit_message>
<xml_diff>
--- a/td16_MVC_inscription.docx
+++ b/td16_MVC_inscription.docx
@@ -4,7 +4,7 @@
   <w:body>
     <w:p>
       <w:pPr>
-        <w:pStyle w:val="777"/>
+        <w:pStyle w:val="940"/>
         <w:pBdr/>
         <w:spacing/>
         <w:ind/>
@@ -53,6 +53,11 @@
           <w:lang w:val="fr-FR"/>
         </w:rPr>
         <w:t xml:space="preserve"> MVC</w:t>
+      </w:r>
+      <w:r>
+        <w:rPr>
+          <w:lang w:val="fr-FR"/>
+        </w:rPr>
       </w:r>
       <w:r>
         <w:rPr>
@@ -148,6 +153,11 @@
           <w:lang w:val="fr-FR"/>
         </w:rPr>
       </w:r>
+      <w:r>
+        <w:rPr>
+          <w:lang w:val="fr-FR"/>
+        </w:rPr>
+      </w:r>
     </w:p>
     <w:p>
       <w:pPr>
@@ -173,6 +183,12 @@
           <w:szCs w:val="18"/>
         </w:rPr>
         <w:t xml:space="preserve"> :</w:t>
+      </w:r>
+      <w:r>
+        <w:rPr>
+          <w:sz w:val="18"/>
+          <w:szCs w:val="18"/>
+        </w:rPr>
       </w:r>
       <w:r>
         <w:rPr>
@@ -520,6 +536,12 @@
           <w:szCs w:val="18"/>
         </w:rPr>
       </w:r>
+      <w:r>
+        <w:rPr>
+          <w:sz w:val="18"/>
+          <w:szCs w:val="18"/>
+        </w:rPr>
+      </w:r>
     </w:p>
     <w:p>
       <w:pPr>
@@ -674,6 +696,12 @@
           <w:szCs w:val="18"/>
         </w:rPr>
       </w:r>
+      <w:r>
+        <w:rPr>
+          <w:sz w:val="18"/>
+          <w:szCs w:val="18"/>
+        </w:rPr>
+      </w:r>
     </w:p>
     <w:p>
       <w:pPr>
@@ -696,10 +724,15 @@
           <w:lang w:val="fr-FR"/>
         </w:rPr>
       </w:r>
+      <w:r>
+        <w:rPr>
+          <w:lang w:val="fr-FR"/>
+        </w:rPr>
+      </w:r>
     </w:p>
     <w:p>
       <w:pPr>
-        <w:pStyle w:val="779"/>
+        <w:pStyle w:val="942"/>
         <w:numPr>
           <w:ilvl w:val="0"/>
           <w:numId w:val="1"/>
@@ -735,6 +768,11 @@
           <w:lang w:val="fr-FR"/>
         </w:rPr>
       </w:r>
+      <w:r>
+        <w:rPr>
+          <w:lang w:val="fr-FR"/>
+        </w:rPr>
+      </w:r>
     </w:p>
     <w:p>
       <w:pPr>
@@ -746,6 +784,11 @@
           <w:lang w:val="fr-FR"/>
         </w:rPr>
       </w:pPr>
+      <w:r>
+        <w:rPr>
+          <w:lang w:val="fr-FR"/>
+        </w:rPr>
+      </w:r>
       <w:r>
         <w:rPr>
           <w:lang w:val="fr-FR"/>
@@ -792,6 +835,13 @@
           <w:lang w:val="fr-FR"/>
         </w:rPr>
       </w:r>
+      <w:r>
+        <w:rPr>
+          <w:b/>
+          <w:bCs/>
+          <w:lang w:val="fr-FR"/>
+        </w:rPr>
+      </w:r>
     </w:p>
     <w:p>
       <w:pPr>
@@ -817,6 +867,15 @@
         <w:rPr>
           <w:b/>
           <w:bCs/>
+          <w:highlight w:val="none"/>
+          <w:lang w:val="fr-FR"/>
+        </w:rPr>
+      </w:r>
+      <w:r>
+        <w:rPr>
+          <w:b/>
+          <w:bCs/>
+          <w:highlight w:val="none"/>
           <w:lang w:val="fr-FR"/>
         </w:rPr>
       </w:r>
@@ -829,6 +888,7 @@
         <w:rPr>
           <w:b/>
           <w:bCs/>
+          <w:highlight w:val="none"/>
           <w:lang w:val="fr-FR"/>
         </w:rPr>
       </w:pPr>
@@ -840,6 +900,88 @@
           <w:lang w:val="fr-FR" w:bidi="fr-FR"/>
         </w:rPr>
         <w:t xml:space="preserve">Refaire le style des erreurs de connexion</w:t>
+      </w:r>
+      <w:r>
+        <w:rPr>
+          <w:b/>
+          <w:bCs/>
+          <w:highlight w:val="none"/>
+          <w:lang w:val="fr-FR"/>
+        </w:rPr>
+        <w:t xml:space="preserve"> et les mettre au dessus ou en dessous du formulaire</w:t>
+      </w:r>
+      <w:r>
+        <w:rPr>
+          <w:b/>
+          <w:bCs/>
+          <w:lang w:val="fr-FR"/>
+        </w:rPr>
+      </w:r>
+      <w:r>
+        <w:rPr>
+          <w:b/>
+          <w:bCs/>
+          <w:highlight w:val="none"/>
+          <w:lang w:val="fr-FR"/>
+        </w:rPr>
+      </w:r>
+    </w:p>
+    <w:p>
+      <w:pPr>
+        <w:pBdr/>
+        <w:spacing/>
+        <w:ind/>
+        <w:rPr>
+          <w:b/>
+          <w:bCs/>
+          <w:highlight w:val="none"/>
+          <w:lang w:val="fr-FR"/>
+        </w:rPr>
+      </w:pPr>
+      <w:r>
+        <w:rPr>
+          <w:b/>
+          <w:bCs/>
+          <w:highlight w:val="none"/>
+          <w:lang w:val="fr-FR" w:bidi="fr-FR"/>
+        </w:rPr>
+        <w:t xml:space="preserve">Créer une nouvelle table catégorie dans la BDD  et faire en sorte que les administrateur (type = 1) puissent créer, modifier et supprimer des posts mais que les utilisateurs (type = 0) ne le puissent pas.</w:t>
+      </w:r>
+      <w:r>
+        <w:rPr>
+          <w:b/>
+          <w:bCs/>
+          <w:highlight w:val="none"/>
+          <w:lang w:val="fr-FR"/>
+        </w:rPr>
+      </w:r>
+      <w:r>
+        <w:rPr>
+          <w:b/>
+          <w:bCs/>
+          <w:lang w:val="fr-FR"/>
+        </w:rPr>
+      </w:r>
+    </w:p>
+    <w:p>
+      <w:pPr>
+        <w:pBdr/>
+        <w:spacing/>
+        <w:ind/>
+        <w:rPr>
+          <w:b/>
+          <w:bCs/>
+          <w:lang w:val="fr-FR"/>
+        </w:rPr>
+      </w:pPr>
+      <w:r>
+        <w:rPr>
+          <w:b/>
+          <w:bCs/>
+          <w:highlight w:val="none"/>
+          <w:lang w:val="fr-FR" w:bidi="fr-FR"/>
+        </w:rPr>
+        <w:t xml:space="preserve">Faire en sorte que l’administrateur puisse supprimer tous commentaires.</w:t>
       </w:r>
       <w:r>
         <w:rPr>
@@ -864,9 +1006,47 @@
         <w:spacing/>
         <w:ind/>
         <w:rPr>
+          <w:b/>
+          <w:bCs/>
+          <w:highlight w:val="none"/>
           <w:lang w:val="fr-FR"/>
         </w:rPr>
       </w:pPr>
+      <w:r>
+        <w:rPr>
+          <w:b/>
+          <w:bCs/>
+          <w:lang w:val="fr-FR"/>
+        </w:rPr>
+        <w:t xml:space="preserve">Faire la Page « Mon Profil » avec les informations de l’utilisateur ainsi que la possibilité de modifier les informations et le mot de passe de l’utilisateur.</w:t>
+      </w:r>
+      <w:r>
+        <w:rPr>
+          <w:b/>
+          <w:bCs/>
+          <w:lang w:val="fr-FR"/>
+        </w:rPr>
+      </w:r>
+      <w:r>
+        <w:rPr>
+          <w:lang w:val="fr-FR"/>
+        </w:rPr>
+      </w:r>
+    </w:p>
+    <w:p>
+      <w:pPr>
+        <w:pBdr/>
+        <w:spacing/>
+        <w:ind/>
+        <w:rPr>
+          <w:lang w:val="fr-FR"/>
+        </w:rPr>
+      </w:pPr>
+      <w:r>
+        <w:rPr>
+          <w:lang w:val="fr-FR"/>
+        </w:rPr>
+      </w:r>
       <w:r>
         <w:rPr>
           <w:lang w:val="fr-FR"/>
@@ -891,10 +1071,48 @@
         <w:rPr>
           <w:lang w:val="fr-FR"/>
         </w:rPr>
-        <w:t xml:space="preserve">.</w:t>
       </w:r>
       <w:r>
         <w:rPr>
+          <w:lang w:val="fr-FR"/>
+        </w:rPr>
+      </w:r>
+      <w:r>
+        <w:rPr>
+          <w:lang w:val="fr-FR"/>
+        </w:rPr>
+      </w:r>
+    </w:p>
+    <w:p>
+      <w:pPr>
+        <w:pBdr/>
+        <w:spacing/>
+        <w:ind/>
+        <w:rPr>
+          <w:lang w:val="fr-FR"/>
+        </w:rPr>
+      </w:pPr>
+      <w:r>
+        <w:rPr>
+          <w:b/>
+          <w:bCs/>
+          <w:highlight w:val="none"/>
+          <w:lang w:val="fr-FR" w:bidi="fr-FR"/>
+        </w:rPr>
+      </w:r>
+      <w:r>
+        <w:rPr>
+          <w:b/>
+          <w:bCs/>
+          <w:highlight w:val="none"/>
+          <w:lang w:val="fr-FR" w:bidi="fr-FR"/>
+        </w:rPr>
+      </w:r>
+      <w:r>
+        <w:rPr>
+          <w:b/>
+          <w:bCs/>
+          <w:highlight w:val="none"/>
           <w:lang w:val="fr-FR"/>
         </w:rPr>
       </w:r>
@@ -961,7 +1179,7 @@
     <w:sdtContent>
       <w:p>
         <w:pPr>
-          <w:pStyle w:val="783"/>
+          <w:pStyle w:val="946"/>
           <w:pBdr/>
           <w:spacing/>
           <w:ind/>
@@ -1003,6 +1221,13 @@
             <w:szCs w:val="24"/>
           </w:rPr>
         </w:r>
+        <w:r>
+          <w:rPr>
+            <w:rFonts w:ascii="Times New Roman" w:hAnsi="Times New Roman" w:cs="Times New Roman"/>
+            <w:sz w:val="24"/>
+            <w:szCs w:val="24"/>
+          </w:rPr>
+        </w:r>
       </w:p>
     </w:sdtContent>
   </w:sdt>
@@ -1046,7 +1271,7 @@
 <w:hdr xmlns:wpc="http://schemas.microsoft.com/office/word/2010/wordprocessingCanvas" xmlns:mc="http://schemas.openxmlformats.org/markup-compatibility/2006" xmlns:o="urn:schemas-microsoft-com:office:office" xmlns:r="http://schemas.openxmlformats.org/officeDocument/2006/relationships" xmlns:m="http://schemas.openxmlformats.org/officeDocument/2006/math" xmlns:v="urn:schemas-microsoft-com:vml" xmlns:wp14="http://schemas.microsoft.com/office/word/2010/wordprocessingDrawing" xmlns:wp="http://schemas.openxmlformats.org/drawingml/2006/wordprocessingDrawing" xmlns:w10="urn:schemas-microsoft-com:office:word" xmlns:w="http://schemas.openxmlformats.org/wordprocessingml/2006/main" xmlns:w14="http://schemas.microsoft.com/office/word/2010/wordml" xmlns:w15="http://schemas.microsoft.com/office/word/2012/wordml" xmlns:wpg="http://schemas.microsoft.com/office/word/2010/wordprocessingGroup" xmlns:wpi="http://schemas.microsoft.com/office/word/2010/wordprocessingInk" xmlns:wne="http://schemas.microsoft.com/office/word/2006/wordml" xmlns:a="http://schemas.openxmlformats.org/drawingml/2006/main" xmlns:wps="http://schemas.microsoft.com/office/word/2010/wordprocessingShape" mc:Ignorable="w14 w15 wp14">
   <w:p>
     <w:pPr>
-      <w:pStyle w:val="781"/>
+      <w:pStyle w:val="944"/>
       <w:pBdr/>
       <w:tabs>
         <w:tab w:val="clear" w:leader="none" w:pos="9072"/>
@@ -2489,9 +2714,9 @@
     <w:lsdException w:name="Bibliography" w:uiPriority="37"/>
     <w:lsdException w:name="TOC Heading" w:uiPriority="39" w:qFormat="1"/>
   </w:latentStyles>
-  <w:style w:type="table" w:styleId="12">
+  <w:style w:type="table" w:styleId="758">
     <w:name w:val="Table Grid"/>
-    <w:basedOn w:val="766"/>
+    <w:basedOn w:val="929"/>
     <w:uiPriority w:val="59"/>
     <w:pPr>
       <w:pBdr/>
@@ -2688,9 +2913,9 @@
       </w:tcPr>
     </w:tblStylePr>
   </w:style>
-  <w:style w:type="table" w:styleId="13">
+  <w:style w:type="table" w:styleId="759">
     <w:name w:val="Table Grid Light"/>
-    <w:basedOn w:val="766"/>
+    <w:basedOn w:val="929"/>
     <w:uiPriority w:val="59"/>
     <w:pPr>
       <w:pBdr/>
@@ -2887,9 +3112,9 @@
       </w:tcPr>
     </w:tblStylePr>
   </w:style>
-  <w:style w:type="table" w:styleId="14">
+  <w:style w:type="table" w:styleId="760">
     <w:name w:val="Plain Table 1"/>
-    <w:basedOn w:val="766"/>
+    <w:basedOn w:val="929"/>
     <w:uiPriority w:val="59"/>
     <w:pPr>
       <w:pBdr/>
@@ -3112,9 +3337,9 @@
       </w:tcPr>
     </w:tblStylePr>
   </w:style>
-  <w:style w:type="table" w:styleId="15">
+  <w:style w:type="table" w:styleId="761">
     <w:name w:val="Plain Table 2"/>
-    <w:basedOn w:val="766"/>
+    <w:basedOn w:val="929"/>
     <w:uiPriority w:val="59"/>
     <w:pPr>
       <w:pBdr/>
@@ -3345,9 +3570,9 @@
       </w:tcPr>
     </w:tblStylePr>
   </w:style>
-  <w:style w:type="table" w:styleId="16">
+  <w:style w:type="table" w:styleId="762">
     <w:name w:val="Plain Table 3"/>
-    <w:basedOn w:val="766"/>
+    <w:basedOn w:val="929"/>
     <w:uiPriority w:val="99"/>
     <w:pPr>
       <w:pBdr/>
@@ -3575,9 +3800,9 @@
       </w:tcPr>
     </w:tblStylePr>
   </w:style>
-  <w:style w:type="table" w:styleId="17">
+  <w:style w:type="table" w:styleId="763">
     <w:name w:val="Plain Table 4"/>
-    <w:basedOn w:val="766"/>
+    <w:basedOn w:val="929"/>
     <w:uiPriority w:val="99"/>
     <w:pPr>
       <w:pBdr/>
@@ -3791,9 +4016,9 @@
       </w:tcPr>
     </w:tblStylePr>
   </w:style>
-  <w:style w:type="table" w:styleId="18">
+  <w:style w:type="table" w:styleId="764">
     <w:name w:val="Plain Table 5"/>
-    <w:basedOn w:val="766"/>
+    <w:basedOn w:val="929"/>
     <w:uiPriority w:val="99"/>
     <w:pPr>
       <w:pBdr/>
@@ -4024,9 +4249,9 @@
       </w:tcPr>
     </w:tblStylePr>
   </w:style>
-  <w:style w:type="table" w:styleId="19">
+  <w:style w:type="table" w:styleId="765">
     <w:name w:val="Grid Table 1 Light"/>
-    <w:basedOn w:val="766"/>
+    <w:basedOn w:val="929"/>
     <w:uiPriority w:val="99"/>
     <w:pPr>
       <w:pBdr/>
@@ -4247,9 +4472,9 @@
       </w:tcPr>
     </w:tblStylePr>
   </w:style>
-  <w:style w:type="table" w:styleId="20">
+  <w:style w:type="table" w:styleId="766">
     <w:name w:val="Grid Table 1 Light - Accent 1"/>
-    <w:basedOn w:val="766"/>
+    <w:basedOn w:val="929"/>
     <w:uiPriority w:val="99"/>
     <w:pPr>
       <w:pBdr/>
@@ -4470,9 +4695,9 @@
       </w:tcPr>
     </w:tblStylePr>
   </w:style>
-  <w:style w:type="table" w:styleId="21">
+  <w:style w:type="table" w:styleId="767">
     <w:name w:val="Grid Table 1 Light - Accent 2"/>
-    <w:basedOn w:val="766"/>
+    <w:basedOn w:val="929"/>
     <w:uiPriority w:val="99"/>
     <w:pPr>
       <w:pBdr/>
@@ -4693,9 +4918,9 @@
       </w:tcPr>
     </w:tblStylePr>
   </w:style>
-  <w:style w:type="table" w:styleId="22">
+  <w:style w:type="table" w:styleId="768">
     <w:name w:val="Grid Table 1 Light - Accent 3"/>
-    <w:basedOn w:val="766"/>
+    <w:basedOn w:val="929"/>
     <w:uiPriority w:val="99"/>
     <w:pPr>
       <w:pBdr/>
@@ -4916,9 +5141,9 @@
       </w:tcPr>
     </w:tblStylePr>
   </w:style>
-  <w:style w:type="table" w:styleId="23">
+  <w:style w:type="table" w:styleId="769">
     <w:name w:val="Grid Table 1 Light - Accent 4"/>
-    <w:basedOn w:val="766"/>
+    <w:basedOn w:val="929"/>
     <w:uiPriority w:val="99"/>
     <w:pPr>
       <w:pBdr/>
@@ -5139,9 +5364,9 @@
       </w:tcPr>
     </w:tblStylePr>
   </w:style>
-  <w:style w:type="table" w:styleId="24">
+  <w:style w:type="table" w:styleId="770">
     <w:name w:val="Grid Table 1 Light - Accent 5"/>
-    <w:basedOn w:val="766"/>
+    <w:basedOn w:val="929"/>
     <w:uiPriority w:val="99"/>
     <w:pPr>
       <w:pBdr/>
@@ -5362,9 +5587,9 @@
       </w:tcPr>
     </w:tblStylePr>
   </w:style>
-  <w:style w:type="table" w:styleId="25">
+  <w:style w:type="table" w:styleId="771">
     <w:name w:val="Grid Table 1 Light - Accent 6"/>
-    <w:basedOn w:val="766"/>
+    <w:basedOn w:val="929"/>
     <w:uiPriority w:val="99"/>
     <w:pPr>
       <w:pBdr/>
@@ -5585,9 +5810,9 @@
       </w:tcPr>
     </w:tblStylePr>
   </w:style>
-  <w:style w:type="table" w:styleId="26">
+  <w:style w:type="table" w:styleId="772">
     <w:name w:val="Grid Table 2"/>
-    <w:basedOn w:val="766"/>
+    <w:basedOn w:val="929"/>
     <w:uiPriority w:val="99"/>
     <w:pPr>
       <w:pBdr/>
@@ -5817,9 +6042,9 @@
       </w:tcPr>
     </w:tblStylePr>
   </w:style>
-  <w:style w:type="table" w:styleId="27">
+  <w:style w:type="table" w:styleId="773">
     <w:name w:val="Grid Table 2 - Accent 1"/>
-    <w:basedOn w:val="766"/>
+    <w:basedOn w:val="929"/>
     <w:uiPriority w:val="99"/>
     <w:pPr>
       <w:pBdr/>
@@ -6049,9 +6274,9 @@
       </w:tcPr>
     </w:tblStylePr>
   </w:style>
-  <w:style w:type="table" w:styleId="28">
+  <w:style w:type="table" w:styleId="774">
     <w:name w:val="Grid Table 2 - Accent 2"/>
-    <w:basedOn w:val="766"/>
+    <w:basedOn w:val="929"/>
     <w:uiPriority w:val="99"/>
     <w:pPr>
       <w:pBdr/>
@@ -6281,9 +6506,9 @@
       </w:tcPr>
     </w:tblStylePr>
   </w:style>
-  <w:style w:type="table" w:styleId="29">
+  <w:style w:type="table" w:styleId="775">
     <w:name w:val="Grid Table 2 - Accent 3"/>
-    <w:basedOn w:val="766"/>
+    <w:basedOn w:val="929"/>
     <w:uiPriority w:val="99"/>
     <w:pPr>
       <w:pBdr/>
@@ -6513,9 +6738,9 @@
       </w:tcPr>
     </w:tblStylePr>
   </w:style>
-  <w:style w:type="table" w:styleId="30">
+  <w:style w:type="table" w:styleId="776">
     <w:name w:val="Grid Table 2 - Accent 4"/>
-    <w:basedOn w:val="766"/>
+    <w:basedOn w:val="929"/>
     <w:uiPriority w:val="99"/>
     <w:pPr>
       <w:pBdr/>
@@ -6745,9 +6970,9 @@
       </w:tcPr>
     </w:tblStylePr>
   </w:style>
-  <w:style w:type="table" w:styleId="31">
+  <w:style w:type="table" w:styleId="777">
     <w:name w:val="Grid Table 2 - Accent 5"/>
-    <w:basedOn w:val="766"/>
+    <w:basedOn w:val="929"/>
     <w:uiPriority w:val="99"/>
     <w:pPr>
       <w:pBdr/>
@@ -6977,9 +7202,9 @@
       </w:tcPr>
     </w:tblStylePr>
   </w:style>
-  <w:style w:type="table" w:styleId="32">
+  <w:style w:type="table" w:styleId="778">
     <w:name w:val="Grid Table 2 - Accent 6"/>
-    <w:basedOn w:val="766"/>
+    <w:basedOn w:val="929"/>
     <w:uiPriority w:val="99"/>
     <w:pPr>
       <w:pBdr/>
@@ -7209,9 +7434,9 @@
       </w:tcPr>
     </w:tblStylePr>
   </w:style>
-  <w:style w:type="table" w:styleId="33">
+  <w:style w:type="table" w:styleId="779">
     <w:name w:val="Grid Table 3"/>
-    <w:basedOn w:val="766"/>
+    <w:basedOn w:val="929"/>
     <w:uiPriority w:val="99"/>
     <w:pPr>
       <w:pBdr/>
@@ -7310,29 +7535,6 @@
         <w:tblBorders/>
       </w:tblPr>
       <w:tcPr>
-        <w:shd w:color="ffffff"/>
-        <w:tcBorders>
-          <w:top w:val="none" w:color="000000" w:sz="4" w:space="0"/>
-          <w:left w:val="none" w:color="000000" w:sz="4" w:space="0"/>
-          <w:bottom w:val="none" w:color="000000" w:sz="4" w:space="0"/>
-          <w:right w:val="none" w:color="000000" w:sz="4" w:space="0"/>
-        </w:tcBorders>
-      </w:tcPr>
-    </w:tblStylePr>
-    <w:tblStylePr w:type="firstRow">
-      <w:rPr>
-        <w:b/>
-        <w:color w:val="404040"/>
-      </w:rPr>
-      <w:pPr>
-        <w:pBdr/>
-        <w:spacing/>
-        <w:ind/>
-      </w:pPr>
-      <w:tblPr>
-        <w:tblBorders/>
-      </w:tblPr>
-      <w:tcPr>
         <w:shd w:val="clear" w:color="ffffff"/>
         <w:tcBorders>
           <w:top w:val="none" w:color="000000" w:sz="4" w:space="0"/>
@@ -7342,30 +7544,7 @@
         </w:tcBorders>
       </w:tcPr>
     </w:tblStylePr>
-    <w:tblStylePr w:type="lastCol">
-      <w:rPr>
-        <w:i/>
-        <w:color w:val="404040"/>
-      </w:rPr>
-      <w:pPr>
-        <w:pBdr/>
-        <w:spacing/>
-        <w:ind/>
-      </w:pPr>
-      <w:tblPr>
-        <w:tblBorders/>
-      </w:tblPr>
-      <w:tcPr>
-        <w:shd w:color="ffffff"/>
-        <w:tcBorders>
-          <w:top w:val="none" w:color="000000" w:sz="4" w:space="0"/>
-          <w:left w:val="none" w:color="000000" w:sz="4" w:space="0"/>
-          <w:bottom w:val="none" w:color="000000" w:sz="4" w:space="0"/>
-          <w:right w:val="none" w:color="000000" w:sz="4" w:space="0"/>
-        </w:tcBorders>
-      </w:tcPr>
-    </w:tblStylePr>
-    <w:tblStylePr w:type="lastRow">
+    <w:tblStylePr w:type="firstRow">
       <w:rPr>
         <w:b/>
         <w:color w:val="404040"/>
@@ -7388,6 +7567,52 @@
         </w:tcBorders>
       </w:tcPr>
     </w:tblStylePr>
+    <w:tblStylePr w:type="lastCol">
+      <w:rPr>
+        <w:i/>
+        <w:color w:val="404040"/>
+      </w:rPr>
+      <w:pPr>
+        <w:pBdr/>
+        <w:spacing/>
+        <w:ind/>
+      </w:pPr>
+      <w:tblPr>
+        <w:tblBorders/>
+      </w:tblPr>
+      <w:tcPr>
+        <w:shd w:val="clear" w:color="ffffff"/>
+        <w:tcBorders>
+          <w:top w:val="none" w:color="000000" w:sz="4" w:space="0"/>
+          <w:left w:val="none" w:color="000000" w:sz="4" w:space="0"/>
+          <w:bottom w:val="none" w:color="000000" w:sz="4" w:space="0"/>
+          <w:right w:val="none" w:color="000000" w:sz="4" w:space="0"/>
+        </w:tcBorders>
+      </w:tcPr>
+    </w:tblStylePr>
+    <w:tblStylePr w:type="lastRow">
+      <w:rPr>
+        <w:b/>
+        <w:color w:val="404040"/>
+      </w:rPr>
+      <w:pPr>
+        <w:pBdr/>
+        <w:spacing/>
+        <w:ind/>
+      </w:pPr>
+      <w:tblPr>
+        <w:tblBorders/>
+      </w:tblPr>
+      <w:tcPr>
+        <w:shd w:val="clear" w:color="ffffff"/>
+        <w:tcBorders>
+          <w:top w:val="none" w:color="000000" w:sz="4" w:space="0"/>
+          <w:left w:val="none" w:color="000000" w:sz="4" w:space="0"/>
+          <w:bottom w:val="none" w:color="000000" w:sz="4" w:space="0"/>
+          <w:right w:val="none" w:color="000000" w:sz="4" w:space="0"/>
+        </w:tcBorders>
+      </w:tcPr>
+    </w:tblStylePr>
     <w:tblStylePr w:type="nwCell">
       <w:pPr>
         <w:pBdr/>
@@ -7454,9 +7679,9 @@
       </w:tcPr>
     </w:tblStylePr>
   </w:style>
-  <w:style w:type="table" w:styleId="34">
+  <w:style w:type="table" w:styleId="780">
     <w:name w:val="Grid Table 3 - Accent 1"/>
-    <w:basedOn w:val="766"/>
+    <w:basedOn w:val="929"/>
     <w:uiPriority w:val="99"/>
     <w:pPr>
       <w:pBdr/>
@@ -7555,29 +7780,6 @@
         <w:tblBorders/>
       </w:tblPr>
       <w:tcPr>
-        <w:shd w:color="ffffff"/>
-        <w:tcBorders>
-          <w:top w:val="none" w:color="000000" w:sz="4" w:space="0"/>
-          <w:left w:val="none" w:color="000000" w:sz="4" w:space="0"/>
-          <w:bottom w:val="none" w:color="000000" w:sz="4" w:space="0"/>
-          <w:right w:val="none" w:color="000000" w:sz="4" w:space="0"/>
-        </w:tcBorders>
-      </w:tcPr>
-    </w:tblStylePr>
-    <w:tblStylePr w:type="firstRow">
-      <w:rPr>
-        <w:b/>
-        <w:color w:val="404040"/>
-      </w:rPr>
-      <w:pPr>
-        <w:pBdr/>
-        <w:spacing/>
-        <w:ind/>
-      </w:pPr>
-      <w:tblPr>
-        <w:tblBorders/>
-      </w:tblPr>
-      <w:tcPr>
         <w:shd w:val="clear" w:color="ffffff"/>
         <w:tcBorders>
           <w:top w:val="none" w:color="000000" w:sz="4" w:space="0"/>
@@ -7587,30 +7789,7 @@
         </w:tcBorders>
       </w:tcPr>
     </w:tblStylePr>
-    <w:tblStylePr w:type="lastCol">
-      <w:rPr>
-        <w:i/>
-        <w:color w:val="404040"/>
-      </w:rPr>
-      <w:pPr>
-        <w:pBdr/>
-        <w:spacing/>
-        <w:ind/>
-      </w:pPr>
-      <w:tblPr>
-        <w:tblBorders/>
-      </w:tblPr>
-      <w:tcPr>
-        <w:shd w:color="ffffff"/>
-        <w:tcBorders>
-          <w:top w:val="none" w:color="000000" w:sz="4" w:space="0"/>
-          <w:left w:val="none" w:color="000000" w:sz="4" w:space="0"/>
-          <w:bottom w:val="none" w:color="000000" w:sz="4" w:space="0"/>
-          <w:right w:val="none" w:color="000000" w:sz="4" w:space="0"/>
-        </w:tcBorders>
-      </w:tcPr>
-    </w:tblStylePr>
-    <w:tblStylePr w:type="lastRow">
+    <w:tblStylePr w:type="firstRow">
       <w:rPr>
         <w:b/>
         <w:color w:val="404040"/>
@@ -7633,6 +7812,52 @@
         </w:tcBorders>
       </w:tcPr>
     </w:tblStylePr>
+    <w:tblStylePr w:type="lastCol">
+      <w:rPr>
+        <w:i/>
+        <w:color w:val="404040"/>
+      </w:rPr>
+      <w:pPr>
+        <w:pBdr/>
+        <w:spacing/>
+        <w:ind/>
+      </w:pPr>
+      <w:tblPr>
+        <w:tblBorders/>
+      </w:tblPr>
+      <w:tcPr>
+        <w:shd w:val="clear" w:color="ffffff"/>
+        <w:tcBorders>
+          <w:top w:val="none" w:color="000000" w:sz="4" w:space="0"/>
+          <w:left w:val="none" w:color="000000" w:sz="4" w:space="0"/>
+          <w:bottom w:val="none" w:color="000000" w:sz="4" w:space="0"/>
+          <w:right w:val="none" w:color="000000" w:sz="4" w:space="0"/>
+        </w:tcBorders>
+      </w:tcPr>
+    </w:tblStylePr>
+    <w:tblStylePr w:type="lastRow">
+      <w:rPr>
+        <w:b/>
+        <w:color w:val="404040"/>
+      </w:rPr>
+      <w:pPr>
+        <w:pBdr/>
+        <w:spacing/>
+        <w:ind/>
+      </w:pPr>
+      <w:tblPr>
+        <w:tblBorders/>
+      </w:tblPr>
+      <w:tcPr>
+        <w:shd w:val="clear" w:color="ffffff"/>
+        <w:tcBorders>
+          <w:top w:val="none" w:color="000000" w:sz="4" w:space="0"/>
+          <w:left w:val="none" w:color="000000" w:sz="4" w:space="0"/>
+          <w:bottom w:val="none" w:color="000000" w:sz="4" w:space="0"/>
+          <w:right w:val="none" w:color="000000" w:sz="4" w:space="0"/>
+        </w:tcBorders>
+      </w:tcPr>
+    </w:tblStylePr>
     <w:tblStylePr w:type="nwCell">
       <w:pPr>
         <w:pBdr/>
@@ -7699,9 +7924,9 @@
       </w:tcPr>
     </w:tblStylePr>
   </w:style>
-  <w:style w:type="table" w:styleId="35">
+  <w:style w:type="table" w:styleId="781">
     <w:name w:val="Grid Table 3 - Accent 2"/>
-    <w:basedOn w:val="766"/>
+    <w:basedOn w:val="929"/>
     <w:uiPriority w:val="99"/>
     <w:pPr>
       <w:pBdr/>
@@ -7800,29 +8025,6 @@
         <w:tblBorders/>
       </w:tblPr>
       <w:tcPr>
-        <w:shd w:color="ffffff"/>
-        <w:tcBorders>
-          <w:top w:val="none" w:color="000000" w:sz="4" w:space="0"/>
-          <w:left w:val="none" w:color="000000" w:sz="4" w:space="0"/>
-          <w:bottom w:val="none" w:color="000000" w:sz="4" w:space="0"/>
-          <w:right w:val="none" w:color="000000" w:sz="4" w:space="0"/>
-        </w:tcBorders>
-      </w:tcPr>
-    </w:tblStylePr>
-    <w:tblStylePr w:type="firstRow">
-      <w:rPr>
-        <w:b/>
-        <w:color w:val="404040"/>
-      </w:rPr>
-      <w:pPr>
-        <w:pBdr/>
-        <w:spacing/>
-        <w:ind/>
-      </w:pPr>
-      <w:tblPr>
-        <w:tblBorders/>
-      </w:tblPr>
-      <w:tcPr>
         <w:shd w:val="clear" w:color="ffffff"/>
         <w:tcBorders>
           <w:top w:val="none" w:color="000000" w:sz="4" w:space="0"/>
@@ -7832,30 +8034,7 @@
         </w:tcBorders>
       </w:tcPr>
     </w:tblStylePr>
-    <w:tblStylePr w:type="lastCol">
-      <w:rPr>
-        <w:i/>
-        <w:color w:val="404040"/>
-      </w:rPr>
-      <w:pPr>
-        <w:pBdr/>
-        <w:spacing/>
-        <w:ind/>
-      </w:pPr>
-      <w:tblPr>
-        <w:tblBorders/>
-      </w:tblPr>
-      <w:tcPr>
-        <w:shd w:color="ffffff"/>
-        <w:tcBorders>
-          <w:top w:val="none" w:color="000000" w:sz="4" w:space="0"/>
-          <w:left w:val="none" w:color="000000" w:sz="4" w:space="0"/>
-          <w:bottom w:val="none" w:color="000000" w:sz="4" w:space="0"/>
-          <w:right w:val="none" w:color="000000" w:sz="4" w:space="0"/>
-        </w:tcBorders>
-      </w:tcPr>
-    </w:tblStylePr>
-    <w:tblStylePr w:type="lastRow">
+    <w:tblStylePr w:type="firstRow">
       <w:rPr>
         <w:b/>
         <w:color w:val="404040"/>
@@ -7878,6 +8057,52 @@
         </w:tcBorders>
       </w:tcPr>
     </w:tblStylePr>
+    <w:tblStylePr w:type="lastCol">
+      <w:rPr>
+        <w:i/>
+        <w:color w:val="404040"/>
+      </w:rPr>
+      <w:pPr>
+        <w:pBdr/>
+        <w:spacing/>
+        <w:ind/>
+      </w:pPr>
+      <w:tblPr>
+        <w:tblBorders/>
+      </w:tblPr>
+      <w:tcPr>
+        <w:shd w:val="clear" w:color="ffffff"/>
+        <w:tcBorders>
+          <w:top w:val="none" w:color="000000" w:sz="4" w:space="0"/>
+          <w:left w:val="none" w:color="000000" w:sz="4" w:space="0"/>
+          <w:bottom w:val="none" w:color="000000" w:sz="4" w:space="0"/>
+          <w:right w:val="none" w:color="000000" w:sz="4" w:space="0"/>
+        </w:tcBorders>
+      </w:tcPr>
+    </w:tblStylePr>
+    <w:tblStylePr w:type="lastRow">
+      <w:rPr>
+        <w:b/>
+        <w:color w:val="404040"/>
+      </w:rPr>
+      <w:pPr>
+        <w:pBdr/>
+        <w:spacing/>
+        <w:ind/>
+      </w:pPr>
+      <w:tblPr>
+        <w:tblBorders/>
+      </w:tblPr>
+      <w:tcPr>
+        <w:shd w:val="clear" w:color="ffffff"/>
+        <w:tcBorders>
+          <w:top w:val="none" w:color="000000" w:sz="4" w:space="0"/>
+          <w:left w:val="none" w:color="000000" w:sz="4" w:space="0"/>
+          <w:bottom w:val="none" w:color="000000" w:sz="4" w:space="0"/>
+          <w:right w:val="none" w:color="000000" w:sz="4" w:space="0"/>
+        </w:tcBorders>
+      </w:tcPr>
+    </w:tblStylePr>
     <w:tblStylePr w:type="nwCell">
       <w:pPr>
         <w:pBdr/>
@@ -7944,9 +8169,9 @@
       </w:tcPr>
     </w:tblStylePr>
   </w:style>
-  <w:style w:type="table" w:styleId="36">
+  <w:style w:type="table" w:styleId="782">
     <w:name w:val="Grid Table 3 - Accent 3"/>
-    <w:basedOn w:val="766"/>
+    <w:basedOn w:val="929"/>
     <w:uiPriority w:val="99"/>
     <w:pPr>
       <w:pBdr/>
@@ -8045,29 +8270,6 @@
         <w:tblBorders/>
       </w:tblPr>
       <w:tcPr>
-        <w:shd w:color="ffffff"/>
-        <w:tcBorders>
-          <w:top w:val="none" w:color="000000" w:sz="4" w:space="0"/>
-          <w:left w:val="none" w:color="000000" w:sz="4" w:space="0"/>
-          <w:bottom w:val="none" w:color="000000" w:sz="4" w:space="0"/>
-          <w:right w:val="none" w:color="000000" w:sz="4" w:space="0"/>
-        </w:tcBorders>
-      </w:tcPr>
-    </w:tblStylePr>
-    <w:tblStylePr w:type="firstRow">
-      <w:rPr>
-        <w:b/>
-        <w:color w:val="404040"/>
-      </w:rPr>
-      <w:pPr>
-        <w:pBdr/>
-        <w:spacing/>
-        <w:ind/>
-      </w:pPr>
-      <w:tblPr>
-        <w:tblBorders/>
-      </w:tblPr>
-      <w:tcPr>
         <w:shd w:val="clear" w:color="ffffff"/>
         <w:tcBorders>
           <w:top w:val="none" w:color="000000" w:sz="4" w:space="0"/>
@@ -8077,30 +8279,7 @@
         </w:tcBorders>
       </w:tcPr>
     </w:tblStylePr>
-    <w:tblStylePr w:type="lastCol">
-      <w:rPr>
-        <w:i/>
-        <w:color w:val="404040"/>
-      </w:rPr>
-      <w:pPr>
-        <w:pBdr/>
-        <w:spacing/>
-        <w:ind/>
-      </w:pPr>
-      <w:tblPr>
-        <w:tblBorders/>
-      </w:tblPr>
-      <w:tcPr>
-        <w:shd w:color="ffffff"/>
-        <w:tcBorders>
-          <w:top w:val="none" w:color="000000" w:sz="4" w:space="0"/>
-          <w:left w:val="none" w:color="000000" w:sz="4" w:space="0"/>
-          <w:bottom w:val="none" w:color="000000" w:sz="4" w:space="0"/>
-          <w:right w:val="none" w:color="000000" w:sz="4" w:space="0"/>
-        </w:tcBorders>
-      </w:tcPr>
-    </w:tblStylePr>
-    <w:tblStylePr w:type="lastRow">
+    <w:tblStylePr w:type="firstRow">
       <w:rPr>
         <w:b/>
         <w:color w:val="404040"/>
@@ -8123,6 +8302,52 @@
         </w:tcBorders>
       </w:tcPr>
     </w:tblStylePr>
+    <w:tblStylePr w:type="lastCol">
+      <w:rPr>
+        <w:i/>
+        <w:color w:val="404040"/>
+      </w:rPr>
+      <w:pPr>
+        <w:pBdr/>
+        <w:spacing/>
+        <w:ind/>
+      </w:pPr>
+      <w:tblPr>
+        <w:tblBorders/>
+      </w:tblPr>
+      <w:tcPr>
+        <w:shd w:val="clear" w:color="ffffff"/>
+        <w:tcBorders>
+          <w:top w:val="none" w:color="000000" w:sz="4" w:space="0"/>
+          <w:left w:val="none" w:color="000000" w:sz="4" w:space="0"/>
+          <w:bottom w:val="none" w:color="000000" w:sz="4" w:space="0"/>
+          <w:right w:val="none" w:color="000000" w:sz="4" w:space="0"/>
+        </w:tcBorders>
+      </w:tcPr>
+    </w:tblStylePr>
+    <w:tblStylePr w:type="lastRow">
+      <w:rPr>
+        <w:b/>
+        <w:color w:val="404040"/>
+      </w:rPr>
+      <w:pPr>
+        <w:pBdr/>
+        <w:spacing/>
+        <w:ind/>
+      </w:pPr>
+      <w:tblPr>
+        <w:tblBorders/>
+      </w:tblPr>
+      <w:tcPr>
+        <w:shd w:val="clear" w:color="ffffff"/>
+        <w:tcBorders>
+          <w:top w:val="none" w:color="000000" w:sz="4" w:space="0"/>
+          <w:left w:val="none" w:color="000000" w:sz="4" w:space="0"/>
+          <w:bottom w:val="none" w:color="000000" w:sz="4" w:space="0"/>
+          <w:right w:val="none" w:color="000000" w:sz="4" w:space="0"/>
+        </w:tcBorders>
+      </w:tcPr>
+    </w:tblStylePr>
     <w:tblStylePr w:type="nwCell">
       <w:pPr>
         <w:pBdr/>
@@ -8189,9 +8414,9 @@
       </w:tcPr>
     </w:tblStylePr>
   </w:style>
-  <w:style w:type="table" w:styleId="37">
+  <w:style w:type="table" w:styleId="783">
     <w:name w:val="Grid Table 3 - Accent 4"/>
-    <w:basedOn w:val="766"/>
+    <w:basedOn w:val="929"/>
     <w:uiPriority w:val="99"/>
     <w:pPr>
       <w:pBdr/>
@@ -8290,29 +8515,6 @@
         <w:tblBorders/>
       </w:tblPr>
       <w:tcPr>
-        <w:shd w:color="ffffff"/>
-        <w:tcBorders>
-          <w:top w:val="none" w:color="000000" w:sz="4" w:space="0"/>
-          <w:left w:val="none" w:color="000000" w:sz="4" w:space="0"/>
-          <w:bottom w:val="none" w:color="000000" w:sz="4" w:space="0"/>
-          <w:right w:val="none" w:color="000000" w:sz="4" w:space="0"/>
-        </w:tcBorders>
-      </w:tcPr>
-    </w:tblStylePr>
-    <w:tblStylePr w:type="firstRow">
-      <w:rPr>
-        <w:b/>
-        <w:color w:val="404040"/>
-      </w:rPr>
-      <w:pPr>
-        <w:pBdr/>
-        <w:spacing/>
-        <w:ind/>
-      </w:pPr>
-      <w:tblPr>
-        <w:tblBorders/>
-      </w:tblPr>
-      <w:tcPr>
         <w:shd w:val="clear" w:color="ffffff"/>
         <w:tcBorders>
           <w:top w:val="none" w:color="000000" w:sz="4" w:space="0"/>
@@ -8322,30 +8524,7 @@
         </w:tcBorders>
       </w:tcPr>
     </w:tblStylePr>
-    <w:tblStylePr w:type="lastCol">
-      <w:rPr>
-        <w:i/>
-        <w:color w:val="404040"/>
-      </w:rPr>
-      <w:pPr>
-        <w:pBdr/>
-        <w:spacing/>
-        <w:ind/>
-      </w:pPr>
-      <w:tblPr>
-        <w:tblBorders/>
-      </w:tblPr>
-      <w:tcPr>
-        <w:shd w:color="ffffff"/>
-        <w:tcBorders>
-          <w:top w:val="none" w:color="000000" w:sz="4" w:space="0"/>
-          <w:left w:val="none" w:color="000000" w:sz="4" w:space="0"/>
-          <w:bottom w:val="none" w:color="000000" w:sz="4" w:space="0"/>
-          <w:right w:val="none" w:color="000000" w:sz="4" w:space="0"/>
-        </w:tcBorders>
-      </w:tcPr>
-    </w:tblStylePr>
-    <w:tblStylePr w:type="lastRow">
+    <w:tblStylePr w:type="firstRow">
       <w:rPr>
         <w:b/>
         <w:color w:val="404040"/>
@@ -8368,6 +8547,52 @@
         </w:tcBorders>
       </w:tcPr>
     </w:tblStylePr>
+    <w:tblStylePr w:type="lastCol">
+      <w:rPr>
+        <w:i/>
+        <w:color w:val="404040"/>
+      </w:rPr>
+      <w:pPr>
+        <w:pBdr/>
+        <w:spacing/>
+        <w:ind/>
+      </w:pPr>
+      <w:tblPr>
+        <w:tblBorders/>
+      </w:tblPr>
+      <w:tcPr>
+        <w:shd w:val="clear" w:color="ffffff"/>
+        <w:tcBorders>
+          <w:top w:val="none" w:color="000000" w:sz="4" w:space="0"/>
+          <w:left w:val="none" w:color="000000" w:sz="4" w:space="0"/>
+          <w:bottom w:val="none" w:color="000000" w:sz="4" w:space="0"/>
+          <w:right w:val="none" w:color="000000" w:sz="4" w:space="0"/>
+        </w:tcBorders>
+      </w:tcPr>
+    </w:tblStylePr>
+    <w:tblStylePr w:type="lastRow">
+      <w:rPr>
+        <w:b/>
+        <w:color w:val="404040"/>
+      </w:rPr>
+      <w:pPr>
+        <w:pBdr/>
+        <w:spacing/>
+        <w:ind/>
+      </w:pPr>
+      <w:tblPr>
+        <w:tblBorders/>
+      </w:tblPr>
+      <w:tcPr>
+        <w:shd w:val="clear" w:color="ffffff"/>
+        <w:tcBorders>
+          <w:top w:val="none" w:color="000000" w:sz="4" w:space="0"/>
+          <w:left w:val="none" w:color="000000" w:sz="4" w:space="0"/>
+          <w:bottom w:val="none" w:color="000000" w:sz="4" w:space="0"/>
+          <w:right w:val="none" w:color="000000" w:sz="4" w:space="0"/>
+        </w:tcBorders>
+      </w:tcPr>
+    </w:tblStylePr>
     <w:tblStylePr w:type="nwCell">
       <w:pPr>
         <w:pBdr/>
@@ -8434,9 +8659,9 @@
       </w:tcPr>
     </w:tblStylePr>
   </w:style>
-  <w:style w:type="table" w:styleId="38">
+  <w:style w:type="table" w:styleId="784">
     <w:name w:val="Grid Table 3 - Accent 5"/>
-    <w:basedOn w:val="766"/>
+    <w:basedOn w:val="929"/>
     <w:uiPriority w:val="99"/>
     <w:pPr>
       <w:pBdr/>
@@ -8535,29 +8760,6 @@
         <w:tblBorders/>
       </w:tblPr>
       <w:tcPr>
-        <w:shd w:color="ffffff"/>
-        <w:tcBorders>
-          <w:top w:val="none" w:color="000000" w:sz="4" w:space="0"/>
-          <w:left w:val="none" w:color="000000" w:sz="4" w:space="0"/>
-          <w:bottom w:val="none" w:color="000000" w:sz="4" w:space="0"/>
-          <w:right w:val="none" w:color="000000" w:sz="4" w:space="0"/>
-        </w:tcBorders>
-      </w:tcPr>
-    </w:tblStylePr>
-    <w:tblStylePr w:type="firstRow">
-      <w:rPr>
-        <w:b/>
-        <w:color w:val="404040"/>
-      </w:rPr>
-      <w:pPr>
-        <w:pBdr/>
-        <w:spacing/>
-        <w:ind/>
-      </w:pPr>
-      <w:tblPr>
-        <w:tblBorders/>
-      </w:tblPr>
-      <w:tcPr>
         <w:shd w:val="clear" w:color="ffffff"/>
         <w:tcBorders>
           <w:top w:val="none" w:color="000000" w:sz="4" w:space="0"/>
@@ -8567,30 +8769,7 @@
         </w:tcBorders>
       </w:tcPr>
     </w:tblStylePr>
-    <w:tblStylePr w:type="lastCol">
-      <w:rPr>
-        <w:i/>
-        <w:color w:val="404040"/>
-      </w:rPr>
-      <w:pPr>
-        <w:pBdr/>
-        <w:spacing/>
-        <w:ind/>
-      </w:pPr>
-      <w:tblPr>
-        <w:tblBorders/>
-      </w:tblPr>
-      <w:tcPr>
-        <w:shd w:color="ffffff"/>
-        <w:tcBorders>
-          <w:top w:val="none" w:color="000000" w:sz="4" w:space="0"/>
-          <w:left w:val="none" w:color="000000" w:sz="4" w:space="0"/>
-          <w:bottom w:val="none" w:color="000000" w:sz="4" w:space="0"/>
-          <w:right w:val="none" w:color="000000" w:sz="4" w:space="0"/>
-        </w:tcBorders>
-      </w:tcPr>
-    </w:tblStylePr>
-    <w:tblStylePr w:type="lastRow">
+    <w:tblStylePr w:type="firstRow">
       <w:rPr>
         <w:b/>
         <w:color w:val="404040"/>
@@ -8613,6 +8792,52 @@
         </w:tcBorders>
       </w:tcPr>
     </w:tblStylePr>
+    <w:tblStylePr w:type="lastCol">
+      <w:rPr>
+        <w:i/>
+        <w:color w:val="404040"/>
+      </w:rPr>
+      <w:pPr>
+        <w:pBdr/>
+        <w:spacing/>
+        <w:ind/>
+      </w:pPr>
+      <w:tblPr>
+        <w:tblBorders/>
+      </w:tblPr>
+      <w:tcPr>
+        <w:shd w:val="clear" w:color="ffffff"/>
+        <w:tcBorders>
+          <w:top w:val="none" w:color="000000" w:sz="4" w:space="0"/>
+          <w:left w:val="none" w:color="000000" w:sz="4" w:space="0"/>
+          <w:bottom w:val="none" w:color="000000" w:sz="4" w:space="0"/>
+          <w:right w:val="none" w:color="000000" w:sz="4" w:space="0"/>
+        </w:tcBorders>
+      </w:tcPr>
+    </w:tblStylePr>
+    <w:tblStylePr w:type="lastRow">
+      <w:rPr>
+        <w:b/>
+        <w:color w:val="404040"/>
+      </w:rPr>
+      <w:pPr>
+        <w:pBdr/>
+        <w:spacing/>
+        <w:ind/>
+      </w:pPr>
+      <w:tblPr>
+        <w:tblBorders/>
+      </w:tblPr>
+      <w:tcPr>
+        <w:shd w:val="clear" w:color="ffffff"/>
+        <w:tcBorders>
+          <w:top w:val="none" w:color="000000" w:sz="4" w:space="0"/>
+          <w:left w:val="none" w:color="000000" w:sz="4" w:space="0"/>
+          <w:bottom w:val="none" w:color="000000" w:sz="4" w:space="0"/>
+          <w:right w:val="none" w:color="000000" w:sz="4" w:space="0"/>
+        </w:tcBorders>
+      </w:tcPr>
+    </w:tblStylePr>
     <w:tblStylePr w:type="nwCell">
       <w:pPr>
         <w:pBdr/>
@@ -8679,9 +8904,9 @@
       </w:tcPr>
     </w:tblStylePr>
   </w:style>
-  <w:style w:type="table" w:styleId="39">
+  <w:style w:type="table" w:styleId="785">
     <w:name w:val="Grid Table 3 - Accent 6"/>
-    <w:basedOn w:val="766"/>
+    <w:basedOn w:val="929"/>
     <w:uiPriority w:val="99"/>
     <w:pPr>
       <w:pBdr/>
@@ -8780,29 +9005,6 @@
         <w:tblBorders/>
       </w:tblPr>
       <w:tcPr>
-        <w:shd w:color="ffffff"/>
-        <w:tcBorders>
-          <w:top w:val="none" w:color="000000" w:sz="4" w:space="0"/>
-          <w:left w:val="none" w:color="000000" w:sz="4" w:space="0"/>
-          <w:bottom w:val="none" w:color="000000" w:sz="4" w:space="0"/>
-          <w:right w:val="none" w:color="000000" w:sz="4" w:space="0"/>
-        </w:tcBorders>
-      </w:tcPr>
-    </w:tblStylePr>
-    <w:tblStylePr w:type="firstRow">
-      <w:rPr>
-        <w:b/>
-        <w:color w:val="404040"/>
-      </w:rPr>
-      <w:pPr>
-        <w:pBdr/>
-        <w:spacing/>
-        <w:ind/>
-      </w:pPr>
-      <w:tblPr>
-        <w:tblBorders/>
-      </w:tblPr>
-      <w:tcPr>
         <w:shd w:val="clear" w:color="ffffff"/>
         <w:tcBorders>
           <w:top w:val="none" w:color="000000" w:sz="4" w:space="0"/>
@@ -8812,30 +9014,7 @@
         </w:tcBorders>
       </w:tcPr>
     </w:tblStylePr>
-    <w:tblStylePr w:type="lastCol">
-      <w:rPr>
-        <w:i/>
-        <w:color w:val="404040"/>
-      </w:rPr>
-      <w:pPr>
-        <w:pBdr/>
-        <w:spacing/>
-        <w:ind/>
-      </w:pPr>
-      <w:tblPr>
-        <w:tblBorders/>
-      </w:tblPr>
-      <w:tcPr>
-        <w:shd w:color="ffffff"/>
-        <w:tcBorders>
-          <w:top w:val="none" w:color="000000" w:sz="4" w:space="0"/>
-          <w:left w:val="none" w:color="000000" w:sz="4" w:space="0"/>
-          <w:bottom w:val="none" w:color="000000" w:sz="4" w:space="0"/>
-          <w:right w:val="none" w:color="000000" w:sz="4" w:space="0"/>
-        </w:tcBorders>
-      </w:tcPr>
-    </w:tblStylePr>
-    <w:tblStylePr w:type="lastRow">
+    <w:tblStylePr w:type="firstRow">
       <w:rPr>
         <w:b/>
         <w:color w:val="404040"/>
@@ -8858,6 +9037,52 @@
         </w:tcBorders>
       </w:tcPr>
     </w:tblStylePr>
+    <w:tblStylePr w:type="lastCol">
+      <w:rPr>
+        <w:i/>
+        <w:color w:val="404040"/>
+      </w:rPr>
+      <w:pPr>
+        <w:pBdr/>
+        <w:spacing/>
+        <w:ind/>
+      </w:pPr>
+      <w:tblPr>
+        <w:tblBorders/>
+      </w:tblPr>
+      <w:tcPr>
+        <w:shd w:val="clear" w:color="ffffff"/>
+        <w:tcBorders>
+          <w:top w:val="none" w:color="000000" w:sz="4" w:space="0"/>
+          <w:left w:val="none" w:color="000000" w:sz="4" w:space="0"/>
+          <w:bottom w:val="none" w:color="000000" w:sz="4" w:space="0"/>
+          <w:right w:val="none" w:color="000000" w:sz="4" w:space="0"/>
+        </w:tcBorders>
+      </w:tcPr>
+    </w:tblStylePr>
+    <w:tblStylePr w:type="lastRow">
+      <w:rPr>
+        <w:b/>
+        <w:color w:val="404040"/>
+      </w:rPr>
+      <w:pPr>
+        <w:pBdr/>
+        <w:spacing/>
+        <w:ind/>
+      </w:pPr>
+      <w:tblPr>
+        <w:tblBorders/>
+      </w:tblPr>
+      <w:tcPr>
+        <w:shd w:val="clear" w:color="ffffff"/>
+        <w:tcBorders>
+          <w:top w:val="none" w:color="000000" w:sz="4" w:space="0"/>
+          <w:left w:val="none" w:color="000000" w:sz="4" w:space="0"/>
+          <w:bottom w:val="none" w:color="000000" w:sz="4" w:space="0"/>
+          <w:right w:val="none" w:color="000000" w:sz="4" w:space="0"/>
+        </w:tcBorders>
+      </w:tcPr>
+    </w:tblStylePr>
     <w:tblStylePr w:type="nwCell">
       <w:pPr>
         <w:pBdr/>
@@ -8924,9 +9149,9 @@
       </w:tcPr>
     </w:tblStylePr>
   </w:style>
-  <w:style w:type="table" w:styleId="40">
+  <w:style w:type="table" w:styleId="786">
     <w:name w:val="Grid Table 4"/>
-    <w:basedOn w:val="766"/>
+    <w:basedOn w:val="929"/>
     <w:uiPriority w:val="59"/>
     <w:pPr>
       <w:pBdr/>
@@ -9157,9 +9382,9 @@
       </w:tcPr>
     </w:tblStylePr>
   </w:style>
-  <w:style w:type="table" w:styleId="41">
+  <w:style w:type="table" w:styleId="787">
     <w:name w:val="Grid Table 4 - Accent 1"/>
-    <w:basedOn w:val="766"/>
+    <w:basedOn w:val="929"/>
     <w:uiPriority w:val="59"/>
     <w:pPr>
       <w:pBdr/>
@@ -9390,9 +9615,9 @@
       </w:tcPr>
     </w:tblStylePr>
   </w:style>
-  <w:style w:type="table" w:styleId="42">
+  <w:style w:type="table" w:styleId="788">
     <w:name w:val="Grid Table 4 - Accent 2"/>
-    <w:basedOn w:val="766"/>
+    <w:basedOn w:val="929"/>
     <w:uiPriority w:val="59"/>
     <w:pPr>
       <w:pBdr/>
@@ -9623,9 +9848,9 @@
       </w:tcPr>
     </w:tblStylePr>
   </w:style>
-  <w:style w:type="table" w:styleId="43">
+  <w:style w:type="table" w:styleId="789">
     <w:name w:val="Grid Table 4 - Accent 3"/>
-    <w:basedOn w:val="766"/>
+    <w:basedOn w:val="929"/>
     <w:uiPriority w:val="59"/>
     <w:pPr>
       <w:pBdr/>
@@ -9856,9 +10081,9 @@
       </w:tcPr>
     </w:tblStylePr>
   </w:style>
-  <w:style w:type="table" w:styleId="44">
+  <w:style w:type="table" w:styleId="790">
     <w:name w:val="Grid Table 4 - Accent 4"/>
-    <w:basedOn w:val="766"/>
+    <w:basedOn w:val="929"/>
     <w:uiPriority w:val="59"/>
     <w:pPr>
       <w:pBdr/>
@@ -10089,9 +10314,9 @@
       </w:tcPr>
     </w:tblStylePr>
   </w:style>
-  <w:style w:type="table" w:styleId="45">
+  <w:style w:type="table" w:styleId="791">
     <w:name w:val="Grid Table 4 - Accent 5"/>
-    <w:basedOn w:val="766"/>
+    <w:basedOn w:val="929"/>
     <w:uiPriority w:val="59"/>
     <w:pPr>
       <w:pBdr/>
@@ -10322,9 +10547,9 @@
       </w:tcPr>
     </w:tblStylePr>
   </w:style>
-  <w:style w:type="table" w:styleId="46">
+  <w:style w:type="table" w:styleId="792">
     <w:name w:val="Grid Table 4 - Accent 6"/>
-    <w:basedOn w:val="766"/>
+    <w:basedOn w:val="929"/>
     <w:uiPriority w:val="59"/>
     <w:pPr>
       <w:pBdr/>
@@ -10555,9 +10780,9 @@
       </w:tcPr>
     </w:tblStylePr>
   </w:style>
-  <w:style w:type="table" w:styleId="47">
+  <w:style w:type="table" w:styleId="793">
     <w:name w:val="Grid Table 5 Dark"/>
-    <w:basedOn w:val="766"/>
+    <w:basedOn w:val="929"/>
     <w:uiPriority w:val="99"/>
     <w:pPr>
       <w:pBdr/>
@@ -10783,9 +11008,9 @@
       </w:tcPr>
     </w:tblStylePr>
   </w:style>
-  <w:style w:type="table" w:styleId="48">
+  <w:style w:type="table" w:styleId="794">
     <w:name w:val="Grid Table 5 Dark- Accent 1"/>
-    <w:basedOn w:val="766"/>
+    <w:basedOn w:val="929"/>
     <w:uiPriority w:val="99"/>
     <w:pPr>
       <w:pBdr/>
@@ -11011,9 +11236,9 @@
       </w:tcPr>
     </w:tblStylePr>
   </w:style>
-  <w:style w:type="table" w:styleId="49">
+  <w:style w:type="table" w:styleId="795">
     <w:name w:val="Grid Table 5 Dark - Accent 2"/>
-    <w:basedOn w:val="766"/>
+    <w:basedOn w:val="929"/>
     <w:uiPriority w:val="99"/>
     <w:pPr>
       <w:pBdr/>
@@ -11239,9 +11464,9 @@
       </w:tcPr>
     </w:tblStylePr>
   </w:style>
-  <w:style w:type="table" w:styleId="50">
+  <w:style w:type="table" w:styleId="796">
     <w:name w:val="Grid Table 5 Dark - Accent 3"/>
-    <w:basedOn w:val="766"/>
+    <w:basedOn w:val="929"/>
     <w:uiPriority w:val="99"/>
     <w:pPr>
       <w:pBdr/>
@@ -11467,9 +11692,9 @@
       </w:tcPr>
     </w:tblStylePr>
   </w:style>
-  <w:style w:type="table" w:styleId="51">
+  <w:style w:type="table" w:styleId="797">
     <w:name w:val="Grid Table 5 Dark- Accent 4"/>
-    <w:basedOn w:val="766"/>
+    <w:basedOn w:val="929"/>
     <w:uiPriority w:val="99"/>
     <w:pPr>
       <w:pBdr/>
@@ -11695,9 +11920,9 @@
       </w:tcPr>
     </w:tblStylePr>
   </w:style>
-  <w:style w:type="table" w:styleId="52">
+  <w:style w:type="table" w:styleId="798">
     <w:name w:val="Grid Table 5 Dark - Accent 5"/>
-    <w:basedOn w:val="766"/>
+    <w:basedOn w:val="929"/>
     <w:uiPriority w:val="99"/>
     <w:pPr>
       <w:pBdr/>
@@ -11923,9 +12148,9 @@
       </w:tcPr>
     </w:tblStylePr>
   </w:style>
-  <w:style w:type="table" w:styleId="53">
+  <w:style w:type="table" w:styleId="799">
     <w:name w:val="Grid Table 5 Dark - Accent 6"/>
-    <w:basedOn w:val="766"/>
+    <w:basedOn w:val="929"/>
     <w:uiPriority w:val="99"/>
     <w:pPr>
       <w:pBdr/>
@@ -12151,9 +12376,9 @@
       </w:tcPr>
     </w:tblStylePr>
   </w:style>
-  <w:style w:type="table" w:styleId="54">
+  <w:style w:type="table" w:styleId="800">
     <w:name w:val="Grid Table 6 Colorful"/>
-    <w:basedOn w:val="766"/>
+    <w:basedOn w:val="929"/>
     <w:uiPriority w:val="99"/>
     <w:pPr>
       <w:pBdr/>
@@ -12381,9 +12606,9 @@
       </w:tcPr>
     </w:tblStylePr>
   </w:style>
-  <w:style w:type="table" w:styleId="55">
+  <w:style w:type="table" w:styleId="801">
     <w:name w:val="Grid Table 6 Colorful - Accent 1"/>
-    <w:basedOn w:val="766"/>
+    <w:basedOn w:val="929"/>
     <w:uiPriority w:val="99"/>
     <w:pPr>
       <w:pBdr/>
@@ -12611,9 +12836,9 @@
       </w:tcPr>
     </w:tblStylePr>
   </w:style>
-  <w:style w:type="table" w:styleId="56">
+  <w:style w:type="table" w:styleId="802">
     <w:name w:val="Grid Table 6 Colorful - Accent 2"/>
-    <w:basedOn w:val="766"/>
+    <w:basedOn w:val="929"/>
     <w:uiPriority w:val="99"/>
     <w:pPr>
       <w:pBdr/>
@@ -12841,9 +13066,9 @@
       </w:tcPr>
     </w:tblStylePr>
   </w:style>
-  <w:style w:type="table" w:styleId="57">
+  <w:style w:type="table" w:styleId="803">
     <w:name w:val="Grid Table 6 Colorful - Accent 3"/>
-    <w:basedOn w:val="766"/>
+    <w:basedOn w:val="929"/>
     <w:uiPriority w:val="99"/>
     <w:pPr>
       <w:pBdr/>
@@ -13071,9 +13296,9 @@
       </w:tcPr>
     </w:tblStylePr>
   </w:style>
-  <w:style w:type="table" w:styleId="58">
+  <w:style w:type="table" w:styleId="804">
     <w:name w:val="Grid Table 6 Colorful - Accent 4"/>
-    <w:basedOn w:val="766"/>
+    <w:basedOn w:val="929"/>
     <w:uiPriority w:val="99"/>
     <w:pPr>
       <w:pBdr/>
@@ -13301,9 +13526,9 @@
       </w:tcPr>
     </w:tblStylePr>
   </w:style>
-  <w:style w:type="table" w:styleId="59">
+  <w:style w:type="table" w:styleId="805">
     <w:name w:val="Grid Table 6 Colorful - Accent 5"/>
-    <w:basedOn w:val="766"/>
+    <w:basedOn w:val="929"/>
     <w:uiPriority w:val="99"/>
     <w:pPr>
       <w:pBdr/>
@@ -13531,9 +13756,9 @@
       </w:tcPr>
     </w:tblStylePr>
   </w:style>
-  <w:style w:type="table" w:styleId="60">
+  <w:style w:type="table" w:styleId="806">
     <w:name w:val="Grid Table 6 Colorful - Accent 6"/>
-    <w:basedOn w:val="766"/>
+    <w:basedOn w:val="929"/>
     <w:uiPriority w:val="99"/>
     <w:pPr>
       <w:pBdr/>
@@ -13761,9 +13986,9 @@
       </w:tcPr>
     </w:tblStylePr>
   </w:style>
-  <w:style w:type="table" w:styleId="61">
+  <w:style w:type="table" w:styleId="807">
     <w:name w:val="Grid Table 7 Colorful"/>
-    <w:basedOn w:val="766"/>
+    <w:basedOn w:val="929"/>
     <w:uiPriority w:val="99"/>
     <w:pPr>
       <w:pBdr/>
@@ -13865,11 +14090,11 @@
         <w:tblBorders/>
       </w:tblPr>
       <w:tcPr>
-        <w:shd w:color="ffffff"/>
+        <w:shd w:val="clear" w:color="ffffff"/>
         <w:tcBorders>
-          <w:top w:val="none"/>
-          <w:left w:val="none"/>
-          <w:bottom w:val="none"/>
+          <w:top w:val="none" w:color="000000" w:sz="4" w:space="0"/>
+          <w:left w:val="none" w:color="000000" w:sz="4" w:space="0"/>
+          <w:bottom w:val="none" w:color="000000" w:sz="4" w:space="0"/>
           <w:right w:val="single" w:color="000000" w:themeColor="text1" w:themeTint="80" w:sz="4" w:space="0"/>
         </w:tcBorders>
       </w:tcPr>
@@ -13892,10 +14117,10 @@
       <w:tcPr>
         <w:shd w:val="clear" w:color="ffffff" w:themeColor="light1" w:fill="ffffff" w:themeFill="light1"/>
         <w:tcBorders>
-          <w:top w:val="none"/>
-          <w:left w:val="none"/>
+          <w:top w:val="none" w:color="000000" w:sz="4" w:space="0"/>
+          <w:left w:val="none" w:color="000000" w:sz="4" w:space="0"/>
           <w:bottom w:val="single" w:color="000000" w:themeColor="text1" w:themeTint="80" w:sz="4" w:space="0"/>
-          <w:right w:val="none"/>
+          <w:right w:val="none" w:color="000000" w:sz="4" w:space="0"/>
         </w:tcBorders>
       </w:tcPr>
     </w:tblStylePr>
@@ -13915,12 +14140,12 @@
         <w:tblBorders/>
       </w:tblPr>
       <w:tcPr>
-        <w:shd w:color="ffffff"/>
+        <w:shd w:val="clear" w:color="ffffff"/>
         <w:tcBorders>
-          <w:top w:val="none"/>
+          <w:top w:val="none" w:color="000000" w:sz="4" w:space="0"/>
           <w:left w:val="single" w:color="000000" w:themeColor="text1" w:themeTint="80" w:sz="4" w:space="0"/>
-          <w:bottom w:val="none"/>
-          <w:right w:val="none"/>
+          <w:bottom w:val="none" w:color="000000" w:sz="4" w:space="0"/>
+          <w:right w:val="none" w:color="000000" w:sz="4" w:space="0"/>
         </w:tcBorders>
       </w:tcPr>
     </w:tblStylePr>
@@ -13943,9 +14168,9 @@
         <w:shd w:val="clear" w:color="ffffff" w:themeColor="light1" w:fill="ffffff" w:themeFill="light1"/>
         <w:tcBorders>
           <w:top w:val="single" w:color="000000" w:themeColor="text1" w:themeTint="80" w:sz="4" w:space="0"/>
-          <w:left w:val="none"/>
-          <w:bottom w:val="none"/>
-          <w:right w:val="none"/>
+          <w:left w:val="none" w:color="000000" w:sz="4" w:space="0"/>
+          <w:bottom w:val="none" w:color="000000" w:sz="4" w:space="0"/>
+          <w:right w:val="none" w:color="000000" w:sz="4" w:space="0"/>
         </w:tcBorders>
       </w:tcPr>
     </w:tblStylePr>
@@ -14015,9 +14240,9 @@
       </w:tcPr>
     </w:tblStylePr>
   </w:style>
-  <w:style w:type="table" w:styleId="62">
+  <w:style w:type="table" w:styleId="808">
     <w:name w:val="Grid Table 7 Colorful - Accent 1"/>
-    <w:basedOn w:val="766"/>
+    <w:basedOn w:val="929"/>
     <w:uiPriority w:val="99"/>
     <w:pPr>
       <w:pBdr/>
@@ -14119,11 +14344,11 @@
         <w:tblBorders/>
       </w:tblPr>
       <w:tcPr>
-        <w:shd w:color="ffffff"/>
+        <w:shd w:val="clear" w:color="ffffff"/>
         <w:tcBorders>
-          <w:top w:val="none"/>
-          <w:left w:val="none"/>
-          <w:bottom w:val="none"/>
+          <w:top w:val="none" w:color="000000" w:sz="4" w:space="0"/>
+          <w:left w:val="none" w:color="000000" w:sz="4" w:space="0"/>
+          <w:bottom w:val="none" w:color="000000" w:sz="4" w:space="0"/>
           <w:right w:val="single" w:color="000000" w:themeColor="accent1" w:themeTint="80" w:sz="4" w:space="0"/>
         </w:tcBorders>
       </w:tcPr>
@@ -14146,10 +14371,10 @@
       <w:tcPr>
         <w:shd w:val="clear" w:color="ffffff" w:themeColor="light1" w:fill="ffffff" w:themeFill="light1"/>
         <w:tcBorders>
-          <w:top w:val="none"/>
-          <w:left w:val="none"/>
+          <w:top w:val="none" w:color="000000" w:sz="4" w:space="0"/>
+          <w:left w:val="none" w:color="000000" w:sz="4" w:space="0"/>
           <w:bottom w:val="single" w:color="000000" w:themeColor="accent1" w:themeTint="80" w:sz="4" w:space="0"/>
-          <w:right w:val="none"/>
+          <w:right w:val="none" w:color="000000" w:sz="4" w:space="0"/>
         </w:tcBorders>
       </w:tcPr>
     </w:tblStylePr>
@@ -14169,12 +14394,12 @@
         <w:tblBorders/>
       </w:tblPr>
       <w:tcPr>
-        <w:shd w:color="ffffff"/>
+        <w:shd w:val="clear" w:color="ffffff"/>
         <w:tcBorders>
-          <w:top w:val="none"/>
+          <w:top w:val="none" w:color="000000" w:sz="4" w:space="0"/>
           <w:left w:val="single" w:color="000000" w:themeColor="accent1" w:themeTint="80" w:sz="4" w:space="0"/>
-          <w:bottom w:val="none"/>
-          <w:right w:val="none"/>
+          <w:bottom w:val="none" w:color="000000" w:sz="4" w:space="0"/>
+          <w:right w:val="none" w:color="000000" w:sz="4" w:space="0"/>
         </w:tcBorders>
       </w:tcPr>
     </w:tblStylePr>
@@ -14197,9 +14422,9 @@
         <w:shd w:val="clear" w:color="ffffff" w:themeColor="light1" w:fill="ffffff" w:themeFill="light1"/>
         <w:tcBorders>
           <w:top w:val="single" w:color="000000" w:themeColor="accent1" w:themeTint="80" w:sz="4" w:space="0"/>
-          <w:left w:val="none"/>
-          <w:bottom w:val="none"/>
-          <w:right w:val="none"/>
+          <w:left w:val="none" w:color="000000" w:sz="4" w:space="0"/>
+          <w:bottom w:val="none" w:color="000000" w:sz="4" w:space="0"/>
+          <w:right w:val="none" w:color="000000" w:sz="4" w:space="0"/>
         </w:tcBorders>
       </w:tcPr>
     </w:tblStylePr>
@@ -14269,9 +14494,9 @@
       </w:tcPr>
     </w:tblStylePr>
   </w:style>
-  <w:style w:type="table" w:styleId="63">
+  <w:style w:type="table" w:styleId="809">
     <w:name w:val="Grid Table 7 Colorful - Accent 2"/>
-    <w:basedOn w:val="766"/>
+    <w:basedOn w:val="929"/>
     <w:uiPriority w:val="99"/>
     <w:pPr>
       <w:pBdr/>
@@ -14373,11 +14598,11 @@
         <w:tblBorders/>
       </w:tblPr>
       <w:tcPr>
-        <w:shd w:color="ffffff"/>
+        <w:shd w:val="clear" w:color="ffffff"/>
         <w:tcBorders>
-          <w:top w:val="none"/>
-          <w:left w:val="none"/>
-          <w:bottom w:val="none"/>
+          <w:top w:val="none" w:color="000000" w:sz="4" w:space="0"/>
+          <w:left w:val="none" w:color="000000" w:sz="4" w:space="0"/>
+          <w:bottom w:val="none" w:color="000000" w:sz="4" w:space="0"/>
           <w:right w:val="single" w:color="000000" w:themeColor="accent2" w:themeTint="97" w:sz="4" w:space="0"/>
         </w:tcBorders>
       </w:tcPr>
@@ -14400,10 +14625,10 @@
       <w:tcPr>
         <w:shd w:val="clear" w:color="ffffff" w:themeColor="light1" w:fill="ffffff" w:themeFill="light1"/>
         <w:tcBorders>
-          <w:top w:val="none"/>
-          <w:left w:val="none"/>
+          <w:top w:val="none" w:color="000000" w:sz="4" w:space="0"/>
+          <w:left w:val="none" w:color="000000" w:sz="4" w:space="0"/>
           <w:bottom w:val="single" w:color="000000" w:themeColor="accent2" w:themeTint="97" w:sz="4" w:space="0"/>
-          <w:right w:val="none"/>
+          <w:right w:val="none" w:color="000000" w:sz="4" w:space="0"/>
         </w:tcBorders>
       </w:tcPr>
     </w:tblStylePr>
@@ -14423,12 +14648,12 @@
         <w:tblBorders/>
       </w:tblPr>
       <w:tcPr>
-        <w:shd w:color="ffffff"/>
+        <w:shd w:val="clear" w:color="ffffff"/>
         <w:tcBorders>
-          <w:top w:val="none"/>
+          <w:top w:val="none" w:color="000000" w:sz="4" w:space="0"/>
           <w:left w:val="single" w:color="000000" w:themeColor="accent2" w:themeTint="97" w:sz="4" w:space="0"/>
-          <w:bottom w:val="none"/>
-          <w:right w:val="none"/>
+          <w:bottom w:val="none" w:color="000000" w:sz="4" w:space="0"/>
+          <w:right w:val="none" w:color="000000" w:sz="4" w:space="0"/>
         </w:tcBorders>
       </w:tcPr>
     </w:tblStylePr>
@@ -14451,9 +14676,9 @@
         <w:shd w:val="clear" w:color="ffffff" w:themeColor="light1" w:fill="ffffff" w:themeFill="light1"/>
         <w:tcBorders>
           <w:top w:val="single" w:color="000000" w:themeColor="accent2" w:themeTint="97" w:sz="4" w:space="0"/>
-          <w:left w:val="none"/>
-          <w:bottom w:val="none"/>
-          <w:right w:val="none"/>
+          <w:left w:val="none" w:color="000000" w:sz="4" w:space="0"/>
+          <w:bottom w:val="none" w:color="000000" w:sz="4" w:space="0"/>
+          <w:right w:val="none" w:color="000000" w:sz="4" w:space="0"/>
         </w:tcBorders>
       </w:tcPr>
     </w:tblStylePr>
@@ -14523,9 +14748,9 @@
       </w:tcPr>
     </w:tblStylePr>
   </w:style>
-  <w:style w:type="table" w:styleId="64">
+  <w:style w:type="table" w:styleId="810">
     <w:name w:val="Grid Table 7 Colorful - Accent 3"/>
-    <w:basedOn w:val="766"/>
+    <w:basedOn w:val="929"/>
     <w:uiPriority w:val="99"/>
     <w:pPr>
       <w:pBdr/>
@@ -14627,11 +14852,11 @@
         <w:tblBorders/>
       </w:tblPr>
       <w:tcPr>
-        <w:shd w:color="ffffff"/>
+        <w:shd w:val="clear" w:color="ffffff"/>
         <w:tcBorders>
-          <w:top w:val="none"/>
-          <w:left w:val="none"/>
-          <w:bottom w:val="none"/>
+          <w:top w:val="none" w:color="000000" w:sz="4" w:space="0"/>
+          <w:left w:val="none" w:color="000000" w:sz="4" w:space="0"/>
+          <w:bottom w:val="none" w:color="000000" w:sz="4" w:space="0"/>
           <w:right w:val="single" w:color="000000" w:themeColor="accent3" w:themeTint="FE" w:sz="4" w:space="0"/>
         </w:tcBorders>
       </w:tcPr>
@@ -14654,10 +14879,10 @@
       <w:tcPr>
         <w:shd w:val="clear" w:color="ffffff" w:themeColor="light1" w:fill="ffffff" w:themeFill="light1"/>
         <w:tcBorders>
-          <w:top w:val="none"/>
-          <w:left w:val="none"/>
+          <w:top w:val="none" w:color="000000" w:sz="4" w:space="0"/>
+          <w:left w:val="none" w:color="000000" w:sz="4" w:space="0"/>
           <w:bottom w:val="single" w:color="000000" w:themeColor="accent3" w:themeTint="FE" w:sz="4" w:space="0"/>
-          <w:right w:val="none"/>
+          <w:right w:val="none" w:color="000000" w:sz="4" w:space="0"/>
         </w:tcBorders>
       </w:tcPr>
     </w:tblStylePr>
@@ -14677,12 +14902,12 @@
         <w:tblBorders/>
       </w:tblPr>
       <w:tcPr>
-        <w:shd w:color="ffffff"/>
+        <w:shd w:val="clear" w:color="ffffff"/>
         <w:tcBorders>
-          <w:top w:val="none"/>
+          <w:top w:val="none" w:color="000000" w:sz="4" w:space="0"/>
           <w:left w:val="single" w:color="000000" w:themeColor="accent3" w:themeTint="FE" w:sz="4" w:space="0"/>
-          <w:bottom w:val="none"/>
-          <w:right w:val="none"/>
+          <w:bottom w:val="none" w:color="000000" w:sz="4" w:space="0"/>
+          <w:right w:val="none" w:color="000000" w:sz="4" w:space="0"/>
         </w:tcBorders>
       </w:tcPr>
     </w:tblStylePr>
@@ -14705,9 +14930,9 @@
         <w:shd w:val="clear" w:color="ffffff" w:themeColor="light1" w:fill="ffffff" w:themeFill="light1"/>
         <w:tcBorders>
           <w:top w:val="single" w:color="000000" w:themeColor="accent3" w:themeTint="FE" w:sz="4" w:space="0"/>
-          <w:left w:val="none"/>
-          <w:bottom w:val="none"/>
-          <w:right w:val="none"/>
+          <w:left w:val="none" w:color="000000" w:sz="4" w:space="0"/>
+          <w:bottom w:val="none" w:color="000000" w:sz="4" w:space="0"/>
+          <w:right w:val="none" w:color="000000" w:sz="4" w:space="0"/>
         </w:tcBorders>
       </w:tcPr>
     </w:tblStylePr>
@@ -14777,9 +15002,9 @@
       </w:tcPr>
     </w:tblStylePr>
   </w:style>
-  <w:style w:type="table" w:styleId="65">
+  <w:style w:type="table" w:styleId="811">
     <w:name w:val="Grid Table 7 Colorful - Accent 4"/>
-    <w:basedOn w:val="766"/>
+    <w:basedOn w:val="929"/>
     <w:uiPriority w:val="99"/>
     <w:pPr>
       <w:pBdr/>
@@ -14881,11 +15106,11 @@
         <w:tblBorders/>
       </w:tblPr>
       <w:tcPr>
-        <w:shd w:color="ffffff"/>
+        <w:shd w:val="clear" w:color="ffffff"/>
         <w:tcBorders>
-          <w:top w:val="none"/>
-          <w:left w:val="none"/>
-          <w:bottom w:val="none"/>
+          <w:top w:val="none" w:color="000000" w:sz="4" w:space="0"/>
+          <w:left w:val="none" w:color="000000" w:sz="4" w:space="0"/>
+          <w:bottom w:val="none" w:color="000000" w:sz="4" w:space="0"/>
           <w:right w:val="single" w:color="000000" w:themeColor="accent4" w:themeTint="9A" w:sz="4" w:space="0"/>
         </w:tcBorders>
       </w:tcPr>
@@ -14908,10 +15133,10 @@
       <w:tcPr>
         <w:shd w:val="clear" w:color="ffffff" w:themeColor="light1" w:fill="ffffff" w:themeFill="light1"/>
         <w:tcBorders>
-          <w:top w:val="none"/>
-          <w:left w:val="none"/>
+          <w:top w:val="none" w:color="000000" w:sz="4" w:space="0"/>
+          <w:left w:val="none" w:color="000000" w:sz="4" w:space="0"/>
           <w:bottom w:val="single" w:color="000000" w:themeColor="accent4" w:themeTint="9A" w:sz="4" w:space="0"/>
-          <w:right w:val="none"/>
+          <w:right w:val="none" w:color="000000" w:sz="4" w:space="0"/>
         </w:tcBorders>
       </w:tcPr>
     </w:tblStylePr>
@@ -14931,12 +15156,12 @@
         <w:tblBorders/>
       </w:tblPr>
       <w:tcPr>
-        <w:shd w:color="ffffff"/>
+        <w:shd w:val="clear" w:color="ffffff"/>
         <w:tcBorders>
-          <w:top w:val="none"/>
+          <w:top w:val="none" w:color="000000" w:sz="4" w:space="0"/>
           <w:left w:val="single" w:color="000000" w:themeColor="accent4" w:themeTint="9A" w:sz="4" w:space="0"/>
-          <w:bottom w:val="none"/>
-          <w:right w:val="none"/>
+          <w:bottom w:val="none" w:color="000000" w:sz="4" w:space="0"/>
+          <w:right w:val="none" w:color="000000" w:sz="4" w:space="0"/>
         </w:tcBorders>
       </w:tcPr>
     </w:tblStylePr>
@@ -14959,9 +15184,9 @@
         <w:shd w:val="clear" w:color="ffffff" w:themeColor="light1" w:fill="ffffff" w:themeFill="light1"/>
         <w:tcBorders>
           <w:top w:val="single" w:color="000000" w:themeColor="accent4" w:themeTint="9A" w:sz="4" w:space="0"/>
-          <w:left w:val="none"/>
-          <w:bottom w:val="none"/>
-          <w:right w:val="none"/>
+          <w:left w:val="none" w:color="000000" w:sz="4" w:space="0"/>
+          <w:bottom w:val="none" w:color="000000" w:sz="4" w:space="0"/>
+          <w:right w:val="none" w:color="000000" w:sz="4" w:space="0"/>
         </w:tcBorders>
       </w:tcPr>
     </w:tblStylePr>
@@ -15031,9 +15256,9 @@
       </w:tcPr>
     </w:tblStylePr>
   </w:style>
-  <w:style w:type="table" w:styleId="66">
+  <w:style w:type="table" w:styleId="812">
     <w:name w:val="Grid Table 7 Colorful - Accent 5"/>
-    <w:basedOn w:val="766"/>
+    <w:basedOn w:val="929"/>
     <w:uiPriority w:val="99"/>
     <w:pPr>
       <w:pBdr/>
@@ -15135,11 +15360,11 @@
         <w:tblBorders/>
       </w:tblPr>
       <w:tcPr>
-        <w:shd w:color="ffffff"/>
+        <w:shd w:val="clear" w:color="ffffff"/>
         <w:tcBorders>
-          <w:top w:val="none"/>
-          <w:left w:val="none"/>
-          <w:bottom w:val="none"/>
+          <w:top w:val="none" w:color="000000" w:sz="4" w:space="0"/>
+          <w:left w:val="none" w:color="000000" w:sz="4" w:space="0"/>
+          <w:bottom w:val="none" w:color="000000" w:sz="4" w:space="0"/>
           <w:right w:val="single" w:color="000000" w:themeColor="accent5" w:themeTint="90" w:sz="4" w:space="0"/>
         </w:tcBorders>
       </w:tcPr>
@@ -15162,10 +15387,10 @@
       <w:tcPr>
         <w:shd w:val="clear" w:color="ffffff" w:themeColor="light1" w:fill="ffffff" w:themeFill="light1"/>
         <w:tcBorders>
-          <w:top w:val="none"/>
-          <w:left w:val="none"/>
+          <w:top w:val="none" w:color="000000" w:sz="4" w:space="0"/>
+          <w:left w:val="none" w:color="000000" w:sz="4" w:space="0"/>
           <w:bottom w:val="single" w:color="000000" w:themeColor="accent5" w:themeTint="90" w:sz="4" w:space="0"/>
-          <w:right w:val="none"/>
+          <w:right w:val="none" w:color="000000" w:sz="4" w:space="0"/>
         </w:tcBorders>
       </w:tcPr>
     </w:tblStylePr>
@@ -15185,12 +15410,12 @@
         <w:tblBorders/>
       </w:tblPr>
       <w:tcPr>
-        <w:shd w:color="ffffff"/>
+        <w:shd w:val="clear" w:color="ffffff"/>
         <w:tcBorders>
-          <w:top w:val="none"/>
+          <w:top w:val="none" w:color="000000" w:sz="4" w:space="0"/>
           <w:left w:val="single" w:color="000000" w:themeColor="accent5" w:themeTint="90" w:sz="4" w:space="0"/>
-          <w:bottom w:val="none"/>
-          <w:right w:val="none"/>
+          <w:bottom w:val="none" w:color="000000" w:sz="4" w:space="0"/>
+          <w:right w:val="none" w:color="000000" w:sz="4" w:space="0"/>
         </w:tcBorders>
       </w:tcPr>
     </w:tblStylePr>
@@ -15213,9 +15438,9 @@
         <w:shd w:val="clear" w:color="ffffff" w:themeColor="light1" w:fill="ffffff" w:themeFill="light1"/>
         <w:tcBorders>
           <w:top w:val="single" w:color="000000" w:themeColor="accent5" w:themeTint="90" w:sz="4" w:space="0"/>
-          <w:left w:val="none"/>
-          <w:bottom w:val="none"/>
-          <w:right w:val="none"/>
+          <w:left w:val="none" w:color="000000" w:sz="4" w:space="0"/>
+          <w:bottom w:val="none" w:color="000000" w:sz="4" w:space="0"/>
+          <w:right w:val="none" w:color="000000" w:sz="4" w:space="0"/>
         </w:tcBorders>
       </w:tcPr>
     </w:tblStylePr>
@@ -15285,9 +15510,9 @@
       </w:tcPr>
     </w:tblStylePr>
   </w:style>
-  <w:style w:type="table" w:styleId="67">
+  <w:style w:type="table" w:styleId="813">
     <w:name w:val="Grid Table 7 Colorful - Accent 6"/>
-    <w:basedOn w:val="766"/>
+    <w:basedOn w:val="929"/>
     <w:uiPriority w:val="99"/>
     <w:pPr>
       <w:pBdr/>
@@ -15389,11 +15614,11 @@
         <w:tblBorders/>
       </w:tblPr>
       <w:tcPr>
-        <w:shd w:color="ffffff"/>
+        <w:shd w:val="clear" w:color="ffffff"/>
         <w:tcBorders>
-          <w:top w:val="none"/>
-          <w:left w:val="none"/>
-          <w:bottom w:val="none"/>
+          <w:top w:val="none" w:color="000000" w:sz="4" w:space="0"/>
+          <w:left w:val="none" w:color="000000" w:sz="4" w:space="0"/>
+          <w:bottom w:val="none" w:color="000000" w:sz="4" w:space="0"/>
           <w:right w:val="single" w:color="000000" w:themeColor="accent6" w:themeTint="90" w:sz="4" w:space="0"/>
         </w:tcBorders>
       </w:tcPr>
@@ -15416,10 +15641,10 @@
       <w:tcPr>
         <w:shd w:val="clear" w:color="ffffff" w:themeColor="light1" w:fill="ffffff" w:themeFill="light1"/>
         <w:tcBorders>
-          <w:top w:val="none"/>
-          <w:left w:val="none"/>
+          <w:top w:val="none" w:color="000000" w:sz="4" w:space="0"/>
+          <w:left w:val="none" w:color="000000" w:sz="4" w:space="0"/>
           <w:bottom w:val="single" w:color="000000" w:themeColor="accent6" w:themeTint="90" w:sz="4" w:space="0"/>
-          <w:right w:val="none"/>
+          <w:right w:val="none" w:color="000000" w:sz="4" w:space="0"/>
         </w:tcBorders>
       </w:tcPr>
     </w:tblStylePr>
@@ -15439,12 +15664,12 @@
         <w:tblBorders/>
       </w:tblPr>
       <w:tcPr>
-        <w:shd w:color="ffffff"/>
+        <w:shd w:val="clear" w:color="ffffff"/>
         <w:tcBorders>
-          <w:top w:val="none"/>
+          <w:top w:val="none" w:color="000000" w:sz="4" w:space="0"/>
           <w:left w:val="single" w:color="000000" w:themeColor="accent6" w:themeTint="90" w:sz="4" w:space="0"/>
-          <w:bottom w:val="none"/>
-          <w:right w:val="none"/>
+          <w:bottom w:val="none" w:color="000000" w:sz="4" w:space="0"/>
+          <w:right w:val="none" w:color="000000" w:sz="4" w:space="0"/>
         </w:tcBorders>
       </w:tcPr>
     </w:tblStylePr>
@@ -15467,9 +15692,9 @@
         <w:shd w:val="clear" w:color="ffffff" w:themeColor="light1" w:fill="ffffff" w:themeFill="light1"/>
         <w:tcBorders>
           <w:top w:val="single" w:color="000000" w:themeColor="accent6" w:themeTint="90" w:sz="4" w:space="0"/>
-          <w:left w:val="none"/>
-          <w:bottom w:val="none"/>
-          <w:right w:val="none"/>
+          <w:left w:val="none" w:color="000000" w:sz="4" w:space="0"/>
+          <w:bottom w:val="none" w:color="000000" w:sz="4" w:space="0"/>
+          <w:right w:val="none" w:color="000000" w:sz="4" w:space="0"/>
         </w:tcBorders>
       </w:tcPr>
     </w:tblStylePr>
@@ -15539,9 +15764,9 @@
       </w:tcPr>
     </w:tblStylePr>
   </w:style>
-  <w:style w:type="table" w:styleId="68">
+  <w:style w:type="table" w:styleId="814">
     <w:name w:val="List Table 1 Light"/>
-    <w:basedOn w:val="766"/>
+    <w:basedOn w:val="929"/>
     <w:uiPriority w:val="99"/>
     <w:pPr>
       <w:pBdr/>
@@ -15755,9 +15980,9 @@
       </w:tcPr>
     </w:tblStylePr>
   </w:style>
-  <w:style w:type="table" w:styleId="69">
+  <w:style w:type="table" w:styleId="815">
     <w:name w:val="List Table 1 Light - Accent 1"/>
-    <w:basedOn w:val="766"/>
+    <w:basedOn w:val="929"/>
     <w:uiPriority w:val="99"/>
     <w:pPr>
       <w:pBdr/>
@@ -15971,9 +16196,9 @@
       </w:tcPr>
     </w:tblStylePr>
   </w:style>
-  <w:style w:type="table" w:styleId="70">
+  <w:style w:type="table" w:styleId="816">
     <w:name w:val="List Table 1 Light - Accent 2"/>
-    <w:basedOn w:val="766"/>
+    <w:basedOn w:val="929"/>
     <w:uiPriority w:val="99"/>
     <w:pPr>
       <w:pBdr/>
@@ -16187,9 +16412,9 @@
       </w:tcPr>
     </w:tblStylePr>
   </w:style>
-  <w:style w:type="table" w:styleId="71">
+  <w:style w:type="table" w:styleId="817">
     <w:name w:val="List Table 1 Light - Accent 3"/>
-    <w:basedOn w:val="766"/>
+    <w:basedOn w:val="929"/>
     <w:uiPriority w:val="99"/>
     <w:pPr>
       <w:pBdr/>
@@ -16403,9 +16628,9 @@
       </w:tcPr>
     </w:tblStylePr>
   </w:style>
-  <w:style w:type="table" w:styleId="72">
+  <w:style w:type="table" w:styleId="818">
     <w:name w:val="List Table 1 Light - Accent 4"/>
-    <w:basedOn w:val="766"/>
+    <w:basedOn w:val="929"/>
     <w:uiPriority w:val="99"/>
     <w:pPr>
       <w:pBdr/>
@@ -16619,9 +16844,9 @@
       </w:tcPr>
     </w:tblStylePr>
   </w:style>
-  <w:style w:type="table" w:styleId="73">
+  <w:style w:type="table" w:styleId="819">
     <w:name w:val="List Table 1 Light - Accent 5"/>
-    <w:basedOn w:val="766"/>
+    <w:basedOn w:val="929"/>
     <w:uiPriority w:val="99"/>
     <w:pPr>
       <w:pBdr/>
@@ -16835,9 +17060,9 @@
       </w:tcPr>
     </w:tblStylePr>
   </w:style>
-  <w:style w:type="table" w:styleId="74">
+  <w:style w:type="table" w:styleId="820">
     <w:name w:val="List Table 1 Light - Accent 6"/>
-    <w:basedOn w:val="766"/>
+    <w:basedOn w:val="929"/>
     <w:uiPriority w:val="99"/>
     <w:pPr>
       <w:pBdr/>
@@ -17051,9 +17276,9 @@
       </w:tcPr>
     </w:tblStylePr>
   </w:style>
-  <w:style w:type="table" w:styleId="75">
+  <w:style w:type="table" w:styleId="821">
     <w:name w:val="List Table 2"/>
-    <w:basedOn w:val="766"/>
+    <w:basedOn w:val="929"/>
     <w:uiPriority w:val="99"/>
     <w:pPr>
       <w:pBdr/>
@@ -17289,9 +17514,9 @@
       </w:tcPr>
     </w:tblStylePr>
   </w:style>
-  <w:style w:type="table" w:styleId="76">
+  <w:style w:type="table" w:styleId="822">
     <w:name w:val="List Table 2 - Accent 1"/>
-    <w:basedOn w:val="766"/>
+    <w:basedOn w:val="929"/>
     <w:uiPriority w:val="99"/>
     <w:pPr>
       <w:pBdr/>
@@ -17527,9 +17752,9 @@
       </w:tcPr>
     </w:tblStylePr>
   </w:style>
-  <w:style w:type="table" w:styleId="77">
+  <w:style w:type="table" w:styleId="823">
     <w:name w:val="List Table 2 - Accent 2"/>
-    <w:basedOn w:val="766"/>
+    <w:basedOn w:val="929"/>
     <w:uiPriority w:val="99"/>
     <w:pPr>
       <w:pBdr/>
@@ -17765,9 +17990,9 @@
       </w:tcPr>
     </w:tblStylePr>
   </w:style>
-  <w:style w:type="table" w:styleId="78">
+  <w:style w:type="table" w:styleId="824">
     <w:name w:val="List Table 2 - Accent 3"/>
-    <w:basedOn w:val="766"/>
+    <w:basedOn w:val="929"/>
     <w:uiPriority w:val="99"/>
     <w:pPr>
       <w:pBdr/>
@@ -18003,9 +18228,9 @@
       </w:tcPr>
     </w:tblStylePr>
   </w:style>
-  <w:style w:type="table" w:styleId="79">
+  <w:style w:type="table" w:styleId="825">
     <w:name w:val="List Table 2 - Accent 4"/>
-    <w:basedOn w:val="766"/>
+    <w:basedOn w:val="929"/>
     <w:uiPriority w:val="99"/>
     <w:pPr>
       <w:pBdr/>
@@ -18241,9 +18466,9 @@
       </w:tcPr>
     </w:tblStylePr>
   </w:style>
-  <w:style w:type="table" w:styleId="80">
+  <w:style w:type="table" w:styleId="826">
     <w:name w:val="List Table 2 - Accent 5"/>
-    <w:basedOn w:val="766"/>
+    <w:basedOn w:val="929"/>
     <w:uiPriority w:val="99"/>
     <w:pPr>
       <w:pBdr/>
@@ -18479,9 +18704,9 @@
       </w:tcPr>
     </w:tblStylePr>
   </w:style>
-  <w:style w:type="table" w:styleId="81">
+  <w:style w:type="table" w:styleId="827">
     <w:name w:val="List Table 2 - Accent 6"/>
-    <w:basedOn w:val="766"/>
+    <w:basedOn w:val="929"/>
     <w:uiPriority w:val="99"/>
     <w:pPr>
       <w:pBdr/>
@@ -18717,9 +18942,9 @@
       </w:tcPr>
     </w:tblStylePr>
   </w:style>
-  <w:style w:type="table" w:styleId="82">
+  <w:style w:type="table" w:styleId="828">
     <w:name w:val="List Table 3"/>
-    <w:basedOn w:val="766"/>
+    <w:basedOn w:val="929"/>
     <w:uiPriority w:val="99"/>
     <w:pPr>
       <w:pBdr/>
@@ -18945,9 +19170,9 @@
       </w:tcPr>
     </w:tblStylePr>
   </w:style>
-  <w:style w:type="table" w:styleId="83">
+  <w:style w:type="table" w:styleId="829">
     <w:name w:val="List Table 3 - Accent 1"/>
-    <w:basedOn w:val="766"/>
+    <w:basedOn w:val="929"/>
     <w:uiPriority w:val="99"/>
     <w:pPr>
       <w:pBdr/>
@@ -19173,9 +19398,9 @@
       </w:tcPr>
     </w:tblStylePr>
   </w:style>
-  <w:style w:type="table" w:styleId="84">
+  <w:style w:type="table" w:styleId="830">
     <w:name w:val="List Table 3 - Accent 2"/>
-    <w:basedOn w:val="766"/>
+    <w:basedOn w:val="929"/>
     <w:uiPriority w:val="99"/>
     <w:pPr>
       <w:pBdr/>
@@ -19401,9 +19626,9 @@
       </w:tcPr>
     </w:tblStylePr>
   </w:style>
-  <w:style w:type="table" w:styleId="85">
+  <w:style w:type="table" w:styleId="831">
     <w:name w:val="List Table 3 - Accent 3"/>
-    <w:basedOn w:val="766"/>
+    <w:basedOn w:val="929"/>
     <w:uiPriority w:val="99"/>
     <w:pPr>
       <w:pBdr/>
@@ -19629,9 +19854,9 @@
       </w:tcPr>
     </w:tblStylePr>
   </w:style>
-  <w:style w:type="table" w:styleId="86">
+  <w:style w:type="table" w:styleId="832">
     <w:name w:val="List Table 3 - Accent 4"/>
-    <w:basedOn w:val="766"/>
+    <w:basedOn w:val="929"/>
     <w:uiPriority w:val="99"/>
     <w:pPr>
       <w:pBdr/>
@@ -19857,9 +20082,9 @@
       </w:tcPr>
     </w:tblStylePr>
   </w:style>
-  <w:style w:type="table" w:styleId="87">
+  <w:style w:type="table" w:styleId="833">
     <w:name w:val="List Table 3 - Accent 5"/>
-    <w:basedOn w:val="766"/>
+    <w:basedOn w:val="929"/>
     <w:uiPriority w:val="99"/>
     <w:pPr>
       <w:pBdr/>
@@ -20085,9 +20310,9 @@
       </w:tcPr>
     </w:tblStylePr>
   </w:style>
-  <w:style w:type="table" w:styleId="88">
+  <w:style w:type="table" w:styleId="834">
     <w:name w:val="List Table 3 - Accent 6"/>
-    <w:basedOn w:val="766"/>
+    <w:basedOn w:val="929"/>
     <w:uiPriority w:val="99"/>
     <w:pPr>
       <w:pBdr/>
@@ -20313,9 +20538,9 @@
       </w:tcPr>
     </w:tblStylePr>
   </w:style>
-  <w:style w:type="table" w:styleId="89">
+  <w:style w:type="table" w:styleId="835">
     <w:name w:val="List Table 4"/>
-    <w:basedOn w:val="766"/>
+    <w:basedOn w:val="929"/>
     <w:uiPriority w:val="99"/>
     <w:pPr>
       <w:pBdr/>
@@ -20538,9 +20763,9 @@
       </w:tcPr>
     </w:tblStylePr>
   </w:style>
-  <w:style w:type="table" w:styleId="90">
+  <w:style w:type="table" w:styleId="836">
     <w:name w:val="List Table 4 - Accent 1"/>
-    <w:basedOn w:val="766"/>
+    <w:basedOn w:val="929"/>
     <w:uiPriority w:val="99"/>
     <w:pPr>
       <w:pBdr/>
@@ -20763,9 +20988,9 @@
       </w:tcPr>
     </w:tblStylePr>
   </w:style>
-  <w:style w:type="table" w:styleId="91">
+  <w:style w:type="table" w:styleId="837">
     <w:name w:val="List Table 4 - Accent 2"/>
-    <w:basedOn w:val="766"/>
+    <w:basedOn w:val="929"/>
     <w:uiPriority w:val="99"/>
     <w:pPr>
       <w:pBdr/>
@@ -20988,9 +21213,9 @@
       </w:tcPr>
     </w:tblStylePr>
   </w:style>
-  <w:style w:type="table" w:styleId="92">
+  <w:style w:type="table" w:styleId="838">
     <w:name w:val="List Table 4 - Accent 3"/>
-    <w:basedOn w:val="766"/>
+    <w:basedOn w:val="929"/>
     <w:uiPriority w:val="99"/>
     <w:pPr>
       <w:pBdr/>
@@ -21213,9 +21438,9 @@
       </w:tcPr>
     </w:tblStylePr>
   </w:style>
-  <w:style w:type="table" w:styleId="93">
+  <w:style w:type="table" w:styleId="839">
     <w:name w:val="List Table 4 - Accent 4"/>
-    <w:basedOn w:val="766"/>
+    <w:basedOn w:val="929"/>
     <w:uiPriority w:val="99"/>
     <w:pPr>
       <w:pBdr/>
@@ -21438,9 +21663,9 @@
       </w:tcPr>
     </w:tblStylePr>
   </w:style>
-  <w:style w:type="table" w:styleId="94">
+  <w:style w:type="table" w:styleId="840">
     <w:name w:val="List Table 4 - Accent 5"/>
-    <w:basedOn w:val="766"/>
+    <w:basedOn w:val="929"/>
     <w:uiPriority w:val="99"/>
     <w:pPr>
       <w:pBdr/>
@@ -21663,9 +21888,9 @@
       </w:tcPr>
     </w:tblStylePr>
   </w:style>
-  <w:style w:type="table" w:styleId="95">
+  <w:style w:type="table" w:styleId="841">
     <w:name w:val="List Table 4 - Accent 6"/>
-    <w:basedOn w:val="766"/>
+    <w:basedOn w:val="929"/>
     <w:uiPriority w:val="99"/>
     <w:pPr>
       <w:pBdr/>
@@ -21888,9 +22113,9 @@
       </w:tcPr>
     </w:tblStylePr>
   </w:style>
-  <w:style w:type="table" w:styleId="96">
+  <w:style w:type="table" w:styleId="842">
     <w:name w:val="List Table 5 Dark"/>
-    <w:basedOn w:val="766"/>
+    <w:basedOn w:val="929"/>
     <w:uiPriority w:val="99"/>
     <w:pPr>
       <w:pBdr/>
@@ -22130,9 +22355,9 @@
       </w:tcPr>
     </w:tblStylePr>
   </w:style>
-  <w:style w:type="table" w:styleId="97">
+  <w:style w:type="table" w:styleId="843">
     <w:name w:val="List Table 5 Dark - Accent 1"/>
-    <w:basedOn w:val="766"/>
+    <w:basedOn w:val="929"/>
     <w:uiPriority w:val="99"/>
     <w:pPr>
       <w:pBdr/>
@@ -22372,9 +22597,9 @@
       </w:tcPr>
     </w:tblStylePr>
   </w:style>
-  <w:style w:type="table" w:styleId="98">
+  <w:style w:type="table" w:styleId="844">
     <w:name w:val="List Table 5 Dark - Accent 2"/>
-    <w:basedOn w:val="766"/>
+    <w:basedOn w:val="929"/>
     <w:uiPriority w:val="99"/>
     <w:pPr>
       <w:pBdr/>
@@ -22614,9 +22839,9 @@
       </w:tcPr>
     </w:tblStylePr>
   </w:style>
-  <w:style w:type="table" w:styleId="99">
+  <w:style w:type="table" w:styleId="845">
     <w:name w:val="List Table 5 Dark - Accent 3"/>
-    <w:basedOn w:val="766"/>
+    <w:basedOn w:val="929"/>
     <w:uiPriority w:val="99"/>
     <w:pPr>
       <w:pBdr/>
@@ -22856,9 +23081,9 @@
       </w:tcPr>
     </w:tblStylePr>
   </w:style>
-  <w:style w:type="table" w:styleId="100">
+  <w:style w:type="table" w:styleId="846">
     <w:name w:val="List Table 5 Dark - Accent 4"/>
-    <w:basedOn w:val="766"/>
+    <w:basedOn w:val="929"/>
     <w:uiPriority w:val="99"/>
     <w:pPr>
       <w:pBdr/>
@@ -23098,9 +23323,9 @@
       </w:tcPr>
     </w:tblStylePr>
   </w:style>
-  <w:style w:type="table" w:styleId="101">
+  <w:style w:type="table" w:styleId="847">
     <w:name w:val="List Table 5 Dark - Accent 5"/>
-    <w:basedOn w:val="766"/>
+    <w:basedOn w:val="929"/>
     <w:uiPriority w:val="99"/>
     <w:pPr>
       <w:pBdr/>
@@ -23340,9 +23565,9 @@
       </w:tcPr>
     </w:tblStylePr>
   </w:style>
-  <w:style w:type="table" w:styleId="102">
+  <w:style w:type="table" w:styleId="848">
     <w:name w:val="List Table 5 Dark - Accent 6"/>
-    <w:basedOn w:val="766"/>
+    <w:basedOn w:val="929"/>
     <w:uiPriority w:val="99"/>
     <w:pPr>
       <w:pBdr/>
@@ -23582,9 +23807,9 @@
       </w:tcPr>
     </w:tblStylePr>
   </w:style>
-  <w:style w:type="table" w:styleId="103">
+  <w:style w:type="table" w:styleId="849">
     <w:name w:val="List Table 6 Colorful"/>
-    <w:basedOn w:val="766"/>
+    <w:basedOn w:val="929"/>
     <w:uiPriority w:val="99"/>
     <w:pPr>
       <w:pBdr/>
@@ -23805,9 +24030,9 @@
       </w:tcPr>
     </w:tblStylePr>
   </w:style>
-  <w:style w:type="table" w:styleId="104">
+  <w:style w:type="table" w:styleId="850">
     <w:name w:val="List Table 6 Colorful - Accent 1"/>
-    <w:basedOn w:val="766"/>
+    <w:basedOn w:val="929"/>
     <w:uiPriority w:val="99"/>
     <w:pPr>
       <w:pBdr/>
@@ -24028,9 +24253,9 @@
       </w:tcPr>
     </w:tblStylePr>
   </w:style>
-  <w:style w:type="table" w:styleId="105">
+  <w:style w:type="table" w:styleId="851">
     <w:name w:val="List Table 6 Colorful - Accent 2"/>
-    <w:basedOn w:val="766"/>
+    <w:basedOn w:val="929"/>
     <w:uiPriority w:val="99"/>
     <w:pPr>
       <w:pBdr/>
@@ -24251,9 +24476,9 @@
       </w:tcPr>
     </w:tblStylePr>
   </w:style>
-  <w:style w:type="table" w:styleId="106">
+  <w:style w:type="table" w:styleId="852">
     <w:name w:val="List Table 6 Colorful - Accent 3"/>
-    <w:basedOn w:val="766"/>
+    <w:basedOn w:val="929"/>
     <w:uiPriority w:val="99"/>
     <w:pPr>
       <w:pBdr/>
@@ -24474,9 +24699,9 @@
       </w:tcPr>
     </w:tblStylePr>
   </w:style>
-  <w:style w:type="table" w:styleId="107">
+  <w:style w:type="table" w:styleId="853">
     <w:name w:val="List Table 6 Colorful - Accent 4"/>
-    <w:basedOn w:val="766"/>
+    <w:basedOn w:val="929"/>
     <w:uiPriority w:val="99"/>
     <w:pPr>
       <w:pBdr/>
@@ -24697,9 +24922,9 @@
       </w:tcPr>
     </w:tblStylePr>
   </w:style>
-  <w:style w:type="table" w:styleId="108">
+  <w:style w:type="table" w:styleId="854">
     <w:name w:val="List Table 6 Colorful - Accent 5"/>
-    <w:basedOn w:val="766"/>
+    <w:basedOn w:val="929"/>
     <w:uiPriority w:val="99"/>
     <w:pPr>
       <w:pBdr/>
@@ -24920,9 +25145,9 @@
       </w:tcPr>
     </w:tblStylePr>
   </w:style>
-  <w:style w:type="table" w:styleId="109">
+  <w:style w:type="table" w:styleId="855">
     <w:name w:val="List Table 6 Colorful - Accent 6"/>
-    <w:basedOn w:val="766"/>
+    <w:basedOn w:val="929"/>
     <w:uiPriority w:val="99"/>
     <w:pPr>
       <w:pBdr/>
@@ -25143,9 +25368,9 @@
       </w:tcPr>
     </w:tblStylePr>
   </w:style>
-  <w:style w:type="table" w:styleId="110">
+  <w:style w:type="table" w:styleId="856">
     <w:name w:val="List Table 7 Colorful"/>
-    <w:basedOn w:val="766"/>
+    <w:basedOn w:val="929"/>
     <w:uiPriority w:val="99"/>
     <w:pPr>
       <w:pBdr/>
@@ -25244,11 +25469,11 @@
         <w:tblBorders/>
       </w:tblPr>
       <w:tcPr>
-        <w:shd w:color="ffffff"/>
+        <w:shd w:val="clear" w:color="ffffff"/>
         <w:tcBorders>
-          <w:top w:val="none"/>
-          <w:left w:val="none"/>
-          <w:bottom w:val="none"/>
+          <w:top w:val="none" w:color="000000" w:sz="4" w:space="0"/>
+          <w:left w:val="none" w:color="000000" w:sz="4" w:space="0"/>
+          <w:bottom w:val="none" w:color="000000" w:sz="4" w:space="0"/>
           <w:right w:val="single" w:color="000000" w:themeColor="text1" w:themeTint="80" w:sz="4" w:space="0"/>
         </w:tcBorders>
       </w:tcPr>
@@ -25271,10 +25496,10 @@
       <w:tcPr>
         <w:shd w:val="clear" w:color="ffffff" w:themeColor="light1" w:fill="ffffff" w:themeFill="light1"/>
         <w:tcBorders>
-          <w:top w:val="none"/>
-          <w:left w:val="none"/>
+          <w:top w:val="none" w:color="000000" w:sz="4" w:space="0"/>
+          <w:left w:val="none" w:color="000000" w:sz="4" w:space="0"/>
           <w:bottom w:val="single" w:color="000000" w:themeColor="text1" w:themeTint="80" w:sz="4" w:space="0"/>
-          <w:right w:val="none"/>
+          <w:right w:val="none" w:color="000000" w:sz="4" w:space="0"/>
         </w:tcBorders>
       </w:tcPr>
     </w:tblStylePr>
@@ -25294,12 +25519,12 @@
         <w:tblBorders/>
       </w:tblPr>
       <w:tcPr>
-        <w:shd w:color="ffffff"/>
+        <w:shd w:val="clear" w:color="ffffff"/>
         <w:tcBorders>
-          <w:top w:val="none"/>
+          <w:top w:val="none" w:color="000000" w:sz="4" w:space="0"/>
           <w:left w:val="single" w:color="000000" w:themeColor="text1" w:themeTint="80" w:sz="4" w:space="0"/>
-          <w:bottom w:val="none"/>
-          <w:right w:val="none"/>
+          <w:bottom w:val="none" w:color="000000" w:sz="4" w:space="0"/>
+          <w:right w:val="none" w:color="000000" w:sz="4" w:space="0"/>
         </w:tcBorders>
       </w:tcPr>
     </w:tblStylePr>
@@ -25322,9 +25547,9 @@
         <w:shd w:val="clear" w:color="ffffff" w:themeColor="light1" w:fill="ffffff" w:themeFill="light1"/>
         <w:tcBorders>
           <w:top w:val="single" w:color="000000" w:themeColor="text1" w:themeTint="80" w:sz="4" w:space="0"/>
-          <w:left w:val="none"/>
-          <w:bottom w:val="none"/>
-          <w:right w:val="none"/>
+          <w:left w:val="none" w:color="000000" w:sz="4" w:space="0"/>
+          <w:bottom w:val="none" w:color="000000" w:sz="4" w:space="0"/>
+          <w:right w:val="none" w:color="000000" w:sz="4" w:space="0"/>
         </w:tcBorders>
       </w:tcPr>
     </w:tblStylePr>
@@ -25399,9 +25624,9 @@
       </w:tcPr>
     </w:tblStylePr>
   </w:style>
-  <w:style w:type="table" w:styleId="111">
+  <w:style w:type="table" w:styleId="857">
     <w:name w:val="List Table 7 Colorful - Accent 1"/>
-    <w:basedOn w:val="766"/>
+    <w:basedOn w:val="929"/>
     <w:uiPriority w:val="99"/>
     <w:pPr>
       <w:pBdr/>
@@ -25500,11 +25725,11 @@
         <w:tblBorders/>
       </w:tblPr>
       <w:tcPr>
-        <w:shd w:color="ffffff"/>
+        <w:shd w:val="clear" w:color="ffffff"/>
         <w:tcBorders>
-          <w:top w:val="none"/>
-          <w:left w:val="none"/>
-          <w:bottom w:val="none"/>
+          <w:top w:val="none" w:color="000000" w:sz="4" w:space="0"/>
+          <w:left w:val="none" w:color="000000" w:sz="4" w:space="0"/>
+          <w:bottom w:val="none" w:color="000000" w:sz="4" w:space="0"/>
           <w:right w:val="single" w:color="000000" w:themeColor="accent1" w:sz="4" w:space="0"/>
         </w:tcBorders>
       </w:tcPr>
@@ -25527,10 +25752,10 @@
       <w:tcPr>
         <w:shd w:val="clear" w:color="ffffff" w:themeColor="light1" w:fill="ffffff" w:themeFill="light1"/>
         <w:tcBorders>
-          <w:top w:val="none"/>
-          <w:left w:val="none"/>
+          <w:top w:val="none" w:color="000000" w:sz="4" w:space="0"/>
+          <w:left w:val="none" w:color="000000" w:sz="4" w:space="0"/>
           <w:bottom w:val="single" w:color="000000" w:themeColor="accent1" w:sz="4" w:space="0"/>
-          <w:right w:val="none"/>
+          <w:right w:val="none" w:color="000000" w:sz="4" w:space="0"/>
         </w:tcBorders>
       </w:tcPr>
     </w:tblStylePr>
@@ -25550,12 +25775,12 @@
         <w:tblBorders/>
       </w:tblPr>
       <w:tcPr>
-        <w:shd w:color="ffffff"/>
+        <w:shd w:val="clear" w:color="ffffff"/>
         <w:tcBorders>
-          <w:top w:val="none"/>
+          <w:top w:val="none" w:color="000000" w:sz="4" w:space="0"/>
           <w:left w:val="single" w:color="000000" w:themeColor="accent1" w:sz="4" w:space="0"/>
-          <w:bottom w:val="none"/>
-          <w:right w:val="none"/>
+          <w:bottom w:val="none" w:color="000000" w:sz="4" w:space="0"/>
+          <w:right w:val="none" w:color="000000" w:sz="4" w:space="0"/>
         </w:tcBorders>
       </w:tcPr>
     </w:tblStylePr>
@@ -25578,9 +25803,9 @@
         <w:shd w:val="clear" w:color="ffffff" w:themeColor="light1" w:fill="ffffff" w:themeFill="light1"/>
         <w:tcBorders>
           <w:top w:val="single" w:color="000000" w:themeColor="accent1" w:sz="4" w:space="0"/>
-          <w:left w:val="none"/>
-          <w:bottom w:val="none"/>
-          <w:right w:val="none"/>
+          <w:left w:val="none" w:color="000000" w:sz="4" w:space="0"/>
+          <w:bottom w:val="none" w:color="000000" w:sz="4" w:space="0"/>
+          <w:right w:val="none" w:color="000000" w:sz="4" w:space="0"/>
         </w:tcBorders>
       </w:tcPr>
     </w:tblStylePr>
@@ -25655,9 +25880,9 @@
       </w:tcPr>
     </w:tblStylePr>
   </w:style>
-  <w:style w:type="table" w:styleId="112">
+  <w:style w:type="table" w:styleId="858">
     <w:name w:val="List Table 7 Colorful - Accent 2"/>
-    <w:basedOn w:val="766"/>
+    <w:basedOn w:val="929"/>
     <w:uiPriority w:val="99"/>
     <w:pPr>
       <w:pBdr/>
@@ -25756,11 +25981,11 @@
         <w:tblBorders/>
       </w:tblPr>
       <w:tcPr>
-        <w:shd w:color="ffffff"/>
+        <w:shd w:val="clear" w:color="ffffff"/>
         <w:tcBorders>
-          <w:top w:val="none"/>
-          <w:left w:val="none"/>
-          <w:bottom w:val="none"/>
+          <w:top w:val="none" w:color="000000" w:sz="4" w:space="0"/>
+          <w:left w:val="none" w:color="000000" w:sz="4" w:space="0"/>
+          <w:bottom w:val="none" w:color="000000" w:sz="4" w:space="0"/>
           <w:right w:val="single" w:color="000000" w:themeColor="accent2" w:themeTint="97" w:sz="4" w:space="0"/>
         </w:tcBorders>
       </w:tcPr>
@@ -25783,10 +26008,10 @@
       <w:tcPr>
         <w:shd w:val="clear" w:color="ffffff" w:themeColor="light1" w:fill="ffffff" w:themeFill="light1"/>
         <w:tcBorders>
-          <w:top w:val="none"/>
-          <w:left w:val="none"/>
+          <w:top w:val="none" w:color="000000" w:sz="4" w:space="0"/>
+          <w:left w:val="none" w:color="000000" w:sz="4" w:space="0"/>
           <w:bottom w:val="single" w:color="000000" w:themeColor="accent2" w:themeTint="97" w:sz="4" w:space="0"/>
-          <w:right w:val="none"/>
+          <w:right w:val="none" w:color="000000" w:sz="4" w:space="0"/>
         </w:tcBorders>
       </w:tcPr>
     </w:tblStylePr>
@@ -25806,12 +26031,12 @@
         <w:tblBorders/>
       </w:tblPr>
       <w:tcPr>
-        <w:shd w:color="ffffff"/>
+        <w:shd w:val="clear" w:color="ffffff"/>
         <w:tcBorders>
-          <w:top w:val="none"/>
+          <w:top w:val="none" w:color="000000" w:sz="4" w:space="0"/>
           <w:left w:val="single" w:color="000000" w:themeColor="accent2" w:themeTint="97" w:sz="4" w:space="0"/>
-          <w:bottom w:val="none"/>
-          <w:right w:val="none"/>
+          <w:bottom w:val="none" w:color="000000" w:sz="4" w:space="0"/>
+          <w:right w:val="none" w:color="000000" w:sz="4" w:space="0"/>
         </w:tcBorders>
       </w:tcPr>
     </w:tblStylePr>
@@ -25834,9 +26059,9 @@
         <w:shd w:val="clear" w:color="ffffff" w:themeColor="light1" w:fill="ffffff" w:themeFill="light1"/>
         <w:tcBorders>
           <w:top w:val="single" w:color="000000" w:themeColor="accent2" w:themeTint="97" w:sz="4" w:space="0"/>
-          <w:left w:val="none"/>
-          <w:bottom w:val="none"/>
-          <w:right w:val="none"/>
+          <w:left w:val="none" w:color="000000" w:sz="4" w:space="0"/>
+          <w:bottom w:val="none" w:color="000000" w:sz="4" w:space="0"/>
+          <w:right w:val="none" w:color="000000" w:sz="4" w:space="0"/>
         </w:tcBorders>
       </w:tcPr>
     </w:tblStylePr>
@@ -25911,9 +26136,9 @@
       </w:tcPr>
     </w:tblStylePr>
   </w:style>
-  <w:style w:type="table" w:styleId="113">
+  <w:style w:type="table" w:styleId="859">
     <w:name w:val="List Table 7 Colorful - Accent 3"/>
-    <w:basedOn w:val="766"/>
+    <w:basedOn w:val="929"/>
     <w:uiPriority w:val="99"/>
     <w:pPr>
       <w:pBdr/>
@@ -26012,11 +26237,11 @@
         <w:tblBorders/>
       </w:tblPr>
       <w:tcPr>
-        <w:shd w:color="ffffff"/>
+        <w:shd w:val="clear" w:color="ffffff"/>
         <w:tcBorders>
-          <w:top w:val="none"/>
-          <w:left w:val="none"/>
-          <w:bottom w:val="none"/>
+          <w:top w:val="none" w:color="000000" w:sz="4" w:space="0"/>
+          <w:left w:val="none" w:color="000000" w:sz="4" w:space="0"/>
+          <w:bottom w:val="none" w:color="000000" w:sz="4" w:space="0"/>
           <w:right w:val="single" w:color="000000" w:themeColor="accent3" w:themeTint="98" w:sz="4" w:space="0"/>
         </w:tcBorders>
       </w:tcPr>
@@ -26039,10 +26264,10 @@
       <w:tcPr>
         <w:shd w:val="clear" w:color="ffffff" w:themeColor="light1" w:fill="ffffff" w:themeFill="light1"/>
         <w:tcBorders>
-          <w:top w:val="none"/>
-          <w:left w:val="none"/>
+          <w:top w:val="none" w:color="000000" w:sz="4" w:space="0"/>
+          <w:left w:val="none" w:color="000000" w:sz="4" w:space="0"/>
           <w:bottom w:val="single" w:color="000000" w:themeColor="accent3" w:themeTint="98" w:sz="4" w:space="0"/>
-          <w:right w:val="none"/>
+          <w:right w:val="none" w:color="000000" w:sz="4" w:space="0"/>
         </w:tcBorders>
       </w:tcPr>
     </w:tblStylePr>
@@ -26062,12 +26287,12 @@
         <w:tblBorders/>
       </w:tblPr>
       <w:tcPr>
-        <w:shd w:color="ffffff"/>
+        <w:shd w:val="clear" w:color="ffffff"/>
         <w:tcBorders>
-          <w:top w:val="none"/>
+          <w:top w:val="none" w:color="000000" w:sz="4" w:space="0"/>
           <w:left w:val="single" w:color="000000" w:themeColor="accent3" w:themeTint="98" w:sz="4" w:space="0"/>
-          <w:bottom w:val="none"/>
-          <w:right w:val="none"/>
+          <w:bottom w:val="none" w:color="000000" w:sz="4" w:space="0"/>
+          <w:right w:val="none" w:color="000000" w:sz="4" w:space="0"/>
         </w:tcBorders>
       </w:tcPr>
     </w:tblStylePr>
@@ -26090,9 +26315,9 @@
         <w:shd w:val="clear" w:color="ffffff" w:themeColor="light1" w:fill="ffffff" w:themeFill="light1"/>
         <w:tcBorders>
           <w:top w:val="single" w:color="000000" w:themeColor="accent3" w:themeTint="98" w:sz="4" w:space="0"/>
-          <w:left w:val="none"/>
-          <w:bottom w:val="none"/>
-          <w:right w:val="none"/>
+          <w:left w:val="none" w:color="000000" w:sz="4" w:space="0"/>
+          <w:bottom w:val="none" w:color="000000" w:sz="4" w:space="0"/>
+          <w:right w:val="none" w:color="000000" w:sz="4" w:space="0"/>
         </w:tcBorders>
       </w:tcPr>
     </w:tblStylePr>
@@ -26167,9 +26392,9 @@
       </w:tcPr>
     </w:tblStylePr>
   </w:style>
-  <w:style w:type="table" w:styleId="114">
+  <w:style w:type="table" w:styleId="860">
     <w:name w:val="List Table 7 Colorful - Accent 4"/>
-    <w:basedOn w:val="766"/>
+    <w:basedOn w:val="929"/>
     <w:uiPriority w:val="99"/>
     <w:pPr>
       <w:pBdr/>
@@ -26268,11 +26493,11 @@
         <w:tblBorders/>
       </w:tblPr>
       <w:tcPr>
-        <w:shd w:color="ffffff"/>
+        <w:shd w:val="clear" w:color="ffffff"/>
         <w:tcBorders>
-          <w:top w:val="none"/>
-          <w:left w:val="none"/>
-          <w:bottom w:val="none"/>
+          <w:top w:val="none" w:color="000000" w:sz="4" w:space="0"/>
+          <w:left w:val="none" w:color="000000" w:sz="4" w:space="0"/>
+          <w:bottom w:val="none" w:color="000000" w:sz="4" w:space="0"/>
           <w:right w:val="single" w:color="000000" w:themeColor="accent4" w:themeTint="9A" w:sz="4" w:space="0"/>
         </w:tcBorders>
       </w:tcPr>
@@ -26295,10 +26520,10 @@
       <w:tcPr>
         <w:shd w:val="clear" w:color="ffffff" w:themeColor="light1" w:fill="ffffff" w:themeFill="light1"/>
         <w:tcBorders>
-          <w:top w:val="none"/>
-          <w:left w:val="none"/>
+          <w:top w:val="none" w:color="000000" w:sz="4" w:space="0"/>
+          <w:left w:val="none" w:color="000000" w:sz="4" w:space="0"/>
           <w:bottom w:val="single" w:color="000000" w:themeColor="accent4" w:themeTint="9A" w:sz="4" w:space="0"/>
-          <w:right w:val="none"/>
+          <w:right w:val="none" w:color="000000" w:sz="4" w:space="0"/>
         </w:tcBorders>
       </w:tcPr>
     </w:tblStylePr>
@@ -26318,12 +26543,12 @@
         <w:tblBorders/>
       </w:tblPr>
       <w:tcPr>
-        <w:shd w:color="ffffff"/>
+        <w:shd w:val="clear" w:color="ffffff"/>
         <w:tcBorders>
-          <w:top w:val="none"/>
+          <w:top w:val="none" w:color="000000" w:sz="4" w:space="0"/>
           <w:left w:val="single" w:color="000000" w:themeColor="accent4" w:themeTint="9A" w:sz="4" w:space="0"/>
-          <w:bottom w:val="none"/>
-          <w:right w:val="none"/>
+          <w:bottom w:val="none" w:color="000000" w:sz="4" w:space="0"/>
+          <w:right w:val="none" w:color="000000" w:sz="4" w:space="0"/>
         </w:tcBorders>
       </w:tcPr>
     </w:tblStylePr>
@@ -26346,9 +26571,9 @@
         <w:shd w:val="clear" w:color="ffffff" w:themeColor="light1" w:fill="ffffff" w:themeFill="light1"/>
         <w:tcBorders>
           <w:top w:val="single" w:color="000000" w:themeColor="accent4" w:themeTint="9A" w:sz="4" w:space="0"/>
-          <w:left w:val="none"/>
-          <w:bottom w:val="none"/>
-          <w:right w:val="none"/>
+          <w:left w:val="none" w:color="000000" w:sz="4" w:space="0"/>
+          <w:bottom w:val="none" w:color="000000" w:sz="4" w:space="0"/>
+          <w:right w:val="none" w:color="000000" w:sz="4" w:space="0"/>
         </w:tcBorders>
       </w:tcPr>
     </w:tblStylePr>
@@ -26423,9 +26648,9 @@
       </w:tcPr>
     </w:tblStylePr>
   </w:style>
-  <w:style w:type="table" w:styleId="115">
+  <w:style w:type="table" w:styleId="861">
     <w:name w:val="List Table 7 Colorful - Accent 5"/>
-    <w:basedOn w:val="766"/>
+    <w:basedOn w:val="929"/>
     <w:uiPriority w:val="99"/>
     <w:pPr>
       <w:pBdr/>
@@ -26524,11 +26749,11 @@
         <w:tblBorders/>
       </w:tblPr>
       <w:tcPr>
-        <w:shd w:color="ffffff"/>
+        <w:shd w:val="clear" w:color="ffffff"/>
         <w:tcBorders>
-          <w:top w:val="none"/>
-          <w:left w:val="none"/>
-          <w:bottom w:val="none"/>
+          <w:top w:val="none" w:color="000000" w:sz="4" w:space="0"/>
+          <w:left w:val="none" w:color="000000" w:sz="4" w:space="0"/>
+          <w:bottom w:val="none" w:color="000000" w:sz="4" w:space="0"/>
           <w:right w:val="single" w:color="000000" w:themeColor="accent5" w:themeTint="9A" w:sz="4" w:space="0"/>
         </w:tcBorders>
       </w:tcPr>
@@ -26551,10 +26776,10 @@
       <w:tcPr>
         <w:shd w:val="clear" w:color="ffffff" w:themeColor="light1" w:fill="ffffff" w:themeFill="light1"/>
         <w:tcBorders>
-          <w:top w:val="none"/>
-          <w:left w:val="none"/>
+          <w:top w:val="none" w:color="000000" w:sz="4" w:space="0"/>
+          <w:left w:val="none" w:color="000000" w:sz="4" w:space="0"/>
           <w:bottom w:val="single" w:color="000000" w:themeColor="accent5" w:themeTint="9A" w:sz="4" w:space="0"/>
-          <w:right w:val="none"/>
+          <w:right w:val="none" w:color="000000" w:sz="4" w:space="0"/>
         </w:tcBorders>
       </w:tcPr>
     </w:tblStylePr>
@@ -26574,12 +26799,12 @@
         <w:tblBorders/>
       </w:tblPr>
       <w:tcPr>
-        <w:shd w:color="ffffff"/>
+        <w:shd w:val="clear" w:color="ffffff"/>
         <w:tcBorders>
-          <w:top w:val="none"/>
+          <w:top w:val="none" w:color="000000" w:sz="4" w:space="0"/>
           <w:left w:val="single" w:color="000000" w:themeColor="accent5" w:themeTint="9A" w:sz="4" w:space="0"/>
-          <w:bottom w:val="none"/>
-          <w:right w:val="none"/>
+          <w:bottom w:val="none" w:color="000000" w:sz="4" w:space="0"/>
+          <w:right w:val="none" w:color="000000" w:sz="4" w:space="0"/>
         </w:tcBorders>
       </w:tcPr>
     </w:tblStylePr>
@@ -26602,9 +26827,9 @@
         <w:shd w:val="clear" w:color="ffffff" w:themeColor="light1" w:fill="ffffff" w:themeFill="light1"/>
         <w:tcBorders>
           <w:top w:val="single" w:color="000000" w:themeColor="accent5" w:themeTint="9A" w:sz="4" w:space="0"/>
-          <w:left w:val="none"/>
-          <w:bottom w:val="none"/>
-          <w:right w:val="none"/>
+          <w:left w:val="none" w:color="000000" w:sz="4" w:space="0"/>
+          <w:bottom w:val="none" w:color="000000" w:sz="4" w:space="0"/>
+          <w:right w:val="none" w:color="000000" w:sz="4" w:space="0"/>
         </w:tcBorders>
       </w:tcPr>
     </w:tblStylePr>
@@ -26679,9 +26904,9 @@
       </w:tcPr>
     </w:tblStylePr>
   </w:style>
-  <w:style w:type="table" w:styleId="116">
+  <w:style w:type="table" w:styleId="862">
     <w:name w:val="List Table 7 Colorful - Accent 6"/>
-    <w:basedOn w:val="766"/>
+    <w:basedOn w:val="929"/>
     <w:uiPriority w:val="99"/>
     <w:pPr>
       <w:pBdr/>
@@ -26780,11 +27005,11 @@
         <w:tblBorders/>
       </w:tblPr>
       <w:tcPr>
-        <w:shd w:color="ffffff"/>
+        <w:shd w:val="clear" w:color="ffffff"/>
         <w:tcBorders>
-          <w:top w:val="none"/>
-          <w:left w:val="none"/>
-          <w:bottom w:val="none"/>
+          <w:top w:val="none" w:color="000000" w:sz="4" w:space="0"/>
+          <w:left w:val="none" w:color="000000" w:sz="4" w:space="0"/>
+          <w:bottom w:val="none" w:color="000000" w:sz="4" w:space="0"/>
           <w:right w:val="single" w:color="000000" w:themeColor="accent6" w:themeTint="98" w:sz="4" w:space="0"/>
         </w:tcBorders>
       </w:tcPr>
@@ -26807,10 +27032,10 @@
       <w:tcPr>
         <w:shd w:val="clear" w:color="ffffff" w:themeColor="light1" w:fill="ffffff" w:themeFill="light1"/>
         <w:tcBorders>
-          <w:top w:val="none"/>
-          <w:left w:val="none"/>
+          <w:top w:val="none" w:color="000000" w:sz="4" w:space="0"/>
+          <w:left w:val="none" w:color="000000" w:sz="4" w:space="0"/>
           <w:bottom w:val="single" w:color="000000" w:themeColor="accent6" w:themeTint="98" w:sz="4" w:space="0"/>
-          <w:right w:val="none"/>
+          <w:right w:val="none" w:color="000000" w:sz="4" w:space="0"/>
         </w:tcBorders>
       </w:tcPr>
     </w:tblStylePr>
@@ -26830,12 +27055,12 @@
         <w:tblBorders/>
       </w:tblPr>
       <w:tcPr>
-        <w:shd w:color="ffffff"/>
+        <w:shd w:val="clear" w:color="ffffff"/>
         <w:tcBorders>
-          <w:top w:val="none"/>
+          <w:top w:val="none" w:color="000000" w:sz="4" w:space="0"/>
           <w:left w:val="single" w:color="000000" w:themeColor="accent6" w:themeTint="98" w:sz="4" w:space="0"/>
-          <w:bottom w:val="none"/>
-          <w:right w:val="none"/>
+          <w:bottom w:val="none" w:color="000000" w:sz="4" w:space="0"/>
+          <w:right w:val="none" w:color="000000" w:sz="4" w:space="0"/>
         </w:tcBorders>
       </w:tcPr>
     </w:tblStylePr>
@@ -26858,9 +27083,9 @@
         <w:shd w:val="clear" w:color="ffffff" w:themeColor="light1" w:fill="ffffff" w:themeFill="light1"/>
         <w:tcBorders>
           <w:top w:val="single" w:color="000000" w:themeColor="accent6" w:themeTint="98" w:sz="4" w:space="0"/>
-          <w:left w:val="none"/>
-          <w:bottom w:val="none"/>
-          <w:right w:val="none"/>
+          <w:left w:val="none" w:color="000000" w:sz="4" w:space="0"/>
+          <w:bottom w:val="none" w:color="000000" w:sz="4" w:space="0"/>
+          <w:right w:val="none" w:color="000000" w:sz="4" w:space="0"/>
         </w:tcBorders>
       </w:tcPr>
     </w:tblStylePr>
@@ -26935,9 +27160,9 @@
       </w:tcPr>
     </w:tblStylePr>
   </w:style>
-  <w:style w:type="table" w:styleId="117">
+  <w:style w:type="table" w:styleId="863">
     <w:name w:val="Lined - Accent"/>
-    <w:basedOn w:val="766"/>
+    <w:basedOn w:val="929"/>
     <w:uiPriority w:val="99"/>
     <w:pPr>
       <w:pBdr/>
@@ -27172,9 +27397,9 @@
       </w:tcPr>
     </w:tblStylePr>
   </w:style>
-  <w:style w:type="table" w:styleId="118">
+  <w:style w:type="table" w:styleId="864">
     <w:name w:val="Lined - Accent 1"/>
-    <w:basedOn w:val="766"/>
+    <w:basedOn w:val="929"/>
     <w:uiPriority w:val="99"/>
     <w:pPr>
       <w:pBdr/>
@@ -27409,9 +27634,9 @@
       </w:tcPr>
     </w:tblStylePr>
   </w:style>
-  <w:style w:type="table" w:styleId="119">
+  <w:style w:type="table" w:styleId="865">
     <w:name w:val="Lined - Accent 2"/>
-    <w:basedOn w:val="766"/>
+    <w:basedOn w:val="929"/>
     <w:uiPriority w:val="99"/>
     <w:pPr>
       <w:pBdr/>
@@ -27646,9 +27871,9 @@
       </w:tcPr>
     </w:tblStylePr>
   </w:style>
-  <w:style w:type="table" w:styleId="120">
+  <w:style w:type="table" w:styleId="866">
     <w:name w:val="Lined - Accent 3"/>
-    <w:basedOn w:val="766"/>
+    <w:basedOn w:val="929"/>
     <w:uiPriority w:val="99"/>
     <w:pPr>
       <w:pBdr/>
@@ -27883,9 +28108,9 @@
       </w:tcPr>
     </w:tblStylePr>
   </w:style>
-  <w:style w:type="table" w:styleId="121">
+  <w:style w:type="table" w:styleId="867">
     <w:name w:val="Lined - Accent 4"/>
-    <w:basedOn w:val="766"/>
+    <w:basedOn w:val="929"/>
     <w:uiPriority w:val="99"/>
     <w:pPr>
       <w:pBdr/>
@@ -28120,9 +28345,9 @@
       </w:tcPr>
     </w:tblStylePr>
   </w:style>
-  <w:style w:type="table" w:styleId="122">
+  <w:style w:type="table" w:styleId="868">
     <w:name w:val="Lined - Accent 5"/>
-    <w:basedOn w:val="766"/>
+    <w:basedOn w:val="929"/>
     <w:uiPriority w:val="99"/>
     <w:pPr>
       <w:pBdr/>
@@ -28357,9 +28582,9 @@
       </w:tcPr>
     </w:tblStylePr>
   </w:style>
-  <w:style w:type="table" w:styleId="123">
+  <w:style w:type="table" w:styleId="869">
     <w:name w:val="Lined - Accent 6"/>
-    <w:basedOn w:val="766"/>
+    <w:basedOn w:val="929"/>
     <w:uiPriority w:val="99"/>
     <w:pPr>
       <w:pBdr/>
@@ -28594,9 +28819,9 @@
       </w:tcPr>
     </w:tblStylePr>
   </w:style>
-  <w:style w:type="table" w:styleId="124">
+  <w:style w:type="table" w:styleId="870">
     <w:name w:val="Bordered &amp; Lined - Accent"/>
-    <w:basedOn w:val="766"/>
+    <w:basedOn w:val="929"/>
     <w:uiPriority w:val="99"/>
     <w:pPr>
       <w:pBdr/>
@@ -28838,9 +29063,9 @@
       </w:tcPr>
     </w:tblStylePr>
   </w:style>
-  <w:style w:type="table" w:styleId="125">
+  <w:style w:type="table" w:styleId="871">
     <w:name w:val="Bordered &amp; Lined - Accent 1"/>
-    <w:basedOn w:val="766"/>
+    <w:basedOn w:val="929"/>
     <w:uiPriority w:val="99"/>
     <w:pPr>
       <w:pBdr/>
@@ -29082,9 +29307,9 @@
       </w:tcPr>
     </w:tblStylePr>
   </w:style>
-  <w:style w:type="table" w:styleId="126">
+  <w:style w:type="table" w:styleId="872">
     <w:name w:val="Bordered &amp; Lined - Accent 2"/>
-    <w:basedOn w:val="766"/>
+    <w:basedOn w:val="929"/>
     <w:uiPriority w:val="99"/>
     <w:pPr>
       <w:pBdr/>
@@ -29326,9 +29551,9 @@
       </w:tcPr>
     </w:tblStylePr>
   </w:style>
-  <w:style w:type="table" w:styleId="127">
+  <w:style w:type="table" w:styleId="873">
     <w:name w:val="Bordered &amp; Lined - Accent 3"/>
-    <w:basedOn w:val="766"/>
+    <w:basedOn w:val="929"/>
     <w:uiPriority w:val="99"/>
     <w:pPr>
       <w:pBdr/>
@@ -29570,9 +29795,9 @@
       </w:tcPr>
     </w:tblStylePr>
   </w:style>
-  <w:style w:type="table" w:styleId="128">
+  <w:style w:type="table" w:styleId="874">
     <w:name w:val="Bordered &amp; Lined - Accent 4"/>
-    <w:basedOn w:val="766"/>
+    <w:basedOn w:val="929"/>
     <w:uiPriority w:val="99"/>
     <w:pPr>
       <w:pBdr/>
@@ -29814,9 +30039,9 @@
       </w:tcPr>
     </w:tblStylePr>
   </w:style>
-  <w:style w:type="table" w:styleId="129">
+  <w:style w:type="table" w:styleId="875">
     <w:name w:val="Bordered &amp; Lined - Accent 5"/>
-    <w:basedOn w:val="766"/>
+    <w:basedOn w:val="929"/>
     <w:uiPriority w:val="99"/>
     <w:pPr>
       <w:pBdr/>
@@ -30058,9 +30283,9 @@
       </w:tcPr>
     </w:tblStylePr>
   </w:style>
-  <w:style w:type="table" w:styleId="130">
+  <w:style w:type="table" w:styleId="876">
     <w:name w:val="Bordered &amp; Lined - Accent 6"/>
-    <w:basedOn w:val="766"/>
+    <w:basedOn w:val="929"/>
     <w:uiPriority w:val="99"/>
     <w:pPr>
       <w:pBdr/>
@@ -30302,9 +30527,9 @@
       </w:tcPr>
     </w:tblStylePr>
   </w:style>
-  <w:style w:type="table" w:styleId="131">
+  <w:style w:type="table" w:styleId="877">
     <w:name w:val="Bordered"/>
-    <w:basedOn w:val="766"/>
+    <w:basedOn w:val="929"/>
     <w:uiPriority w:val="99"/>
     <w:pPr>
       <w:pBdr/>
@@ -30533,9 +30758,9 @@
       </w:tcPr>
     </w:tblStylePr>
   </w:style>
-  <w:style w:type="table" w:styleId="132">
+  <w:style w:type="table" w:styleId="878">
     <w:name w:val="Bordered - Accent 1"/>
-    <w:basedOn w:val="766"/>
+    <w:basedOn w:val="929"/>
     <w:uiPriority w:val="99"/>
     <w:pPr>
       <w:pBdr/>
@@ -30764,9 +30989,9 @@
       </w:tcPr>
     </w:tblStylePr>
   </w:style>
-  <w:style w:type="table" w:styleId="133">
+  <w:style w:type="table" w:styleId="879">
     <w:name w:val="Bordered - Accent 2"/>
-    <w:basedOn w:val="766"/>
+    <w:basedOn w:val="929"/>
     <w:uiPriority w:val="99"/>
     <w:pPr>
       <w:pBdr/>
@@ -30995,9 +31220,9 @@
       </w:tcPr>
     </w:tblStylePr>
   </w:style>
-  <w:style w:type="table" w:styleId="134">
+  <w:style w:type="table" w:styleId="880">
     <w:name w:val="Bordered - Accent 3"/>
-    <w:basedOn w:val="766"/>
+    <w:basedOn w:val="929"/>
     <w:uiPriority w:val="99"/>
     <w:pPr>
       <w:pBdr/>
@@ -31226,9 +31451,9 @@
       </w:tcPr>
     </w:tblStylePr>
   </w:style>
-  <w:style w:type="table" w:styleId="135">
+  <w:style w:type="table" w:styleId="881">
     <w:name w:val="Bordered - Accent 4"/>
-    <w:basedOn w:val="766"/>
+    <w:basedOn w:val="929"/>
     <w:uiPriority w:val="99"/>
     <w:pPr>
       <w:pBdr/>
@@ -31457,9 +31682,9 @@
       </w:tcPr>
     </w:tblStylePr>
   </w:style>
-  <w:style w:type="table" w:styleId="136">
+  <w:style w:type="table" w:styleId="882">
     <w:name w:val="Bordered - Accent 5"/>
-    <w:basedOn w:val="766"/>
+    <w:basedOn w:val="929"/>
     <w:uiPriority w:val="99"/>
     <w:pPr>
       <w:pBdr/>
@@ -31688,9 +31913,9 @@
       </w:tcPr>
     </w:tblStylePr>
   </w:style>
-  <w:style w:type="table" w:styleId="137">
+  <w:style w:type="table" w:styleId="883">
     <w:name w:val="Bordered - Accent 6"/>
-    <w:basedOn w:val="766"/>
+    <w:basedOn w:val="929"/>
     <w:uiPriority w:val="99"/>
     <w:pPr>
       <w:pBdr/>
@@ -31919,10 +32144,10 @@
       </w:tcPr>
     </w:tblStylePr>
   </w:style>
-  <w:style w:type="character" w:styleId="150">
+  <w:style w:type="character" w:styleId="884">
     <w:name w:val="Heading 1 Char"/>
-    <w:basedOn w:val="765"/>
-    <w:link w:val="756"/>
+    <w:basedOn w:val="928"/>
+    <w:link w:val="919"/>
     <w:uiPriority w:val="9"/>
     <w:pPr>
       <w:pBdr/>
@@ -31936,10 +32161,10 @@
       <w:szCs w:val="40"/>
     </w:rPr>
   </w:style>
-  <w:style w:type="character" w:styleId="151">
+  <w:style w:type="character" w:styleId="885">
     <w:name w:val="Heading 2 Char"/>
-    <w:basedOn w:val="765"/>
-    <w:link w:val="757"/>
+    <w:basedOn w:val="928"/>
+    <w:link w:val="920"/>
     <w:uiPriority w:val="9"/>
     <w:pPr>
       <w:pBdr/>
@@ -31953,10 +32178,10 @@
       <w:szCs w:val="32"/>
     </w:rPr>
   </w:style>
-  <w:style w:type="character" w:styleId="152">
+  <w:style w:type="character" w:styleId="886">
     <w:name w:val="Heading 3 Char"/>
-    <w:basedOn w:val="765"/>
-    <w:link w:val="758"/>
+    <w:basedOn w:val="928"/>
+    <w:link w:val="921"/>
     <w:uiPriority w:val="9"/>
     <w:pPr>
       <w:pBdr/>
@@ -31970,10 +32195,10 @@
       <w:szCs w:val="28"/>
     </w:rPr>
   </w:style>
-  <w:style w:type="character" w:styleId="153">
+  <w:style w:type="character" w:styleId="887">
     <w:name w:val="Heading 4 Char"/>
-    <w:basedOn w:val="765"/>
-    <w:link w:val="759"/>
+    <w:basedOn w:val="928"/>
+    <w:link w:val="922"/>
     <w:uiPriority w:val="9"/>
     <w:pPr>
       <w:pBdr/>
@@ -31987,10 +32212,10 @@
       <w:color w:val="0f4761" w:themeColor="accent1" w:themeShade="BF"/>
     </w:rPr>
   </w:style>
-  <w:style w:type="character" w:styleId="154">
+  <w:style w:type="character" w:styleId="888">
     <w:name w:val="Heading 5 Char"/>
-    <w:basedOn w:val="765"/>
-    <w:link w:val="760"/>
+    <w:basedOn w:val="928"/>
+    <w:link w:val="923"/>
     <w:uiPriority w:val="9"/>
     <w:pPr>
       <w:pBdr/>
@@ -32002,10 +32227,10 @@
       <w:color w:val="0f4761" w:themeColor="accent1" w:themeShade="BF"/>
     </w:rPr>
   </w:style>
-  <w:style w:type="character" w:styleId="155">
+  <w:style w:type="character" w:styleId="889">
     <w:name w:val="Heading 6 Char"/>
-    <w:basedOn w:val="765"/>
-    <w:link w:val="761"/>
+    <w:basedOn w:val="928"/>
+    <w:link w:val="924"/>
     <w:uiPriority w:val="9"/>
     <w:pPr>
       <w:pBdr/>
@@ -32019,10 +32244,10 @@
       <w:color w:val="595959" w:themeColor="text1" w:themeTint="A6"/>
     </w:rPr>
   </w:style>
-  <w:style w:type="character" w:styleId="156">
+  <w:style w:type="character" w:styleId="890">
     <w:name w:val="Heading 7 Char"/>
-    <w:basedOn w:val="765"/>
-    <w:link w:val="762"/>
+    <w:basedOn w:val="928"/>
+    <w:link w:val="925"/>
     <w:uiPriority w:val="9"/>
     <w:pPr>
       <w:pBdr/>
@@ -32034,10 +32259,10 @@
       <w:color w:val="595959" w:themeColor="text1" w:themeTint="A6"/>
     </w:rPr>
   </w:style>
-  <w:style w:type="character" w:styleId="157">
+  <w:style w:type="character" w:styleId="891">
     <w:name w:val="Heading 8 Char"/>
-    <w:basedOn w:val="765"/>
-    <w:link w:val="763"/>
+    <w:basedOn w:val="928"/>
+    <w:link w:val="926"/>
     <w:uiPriority w:val="9"/>
     <w:pPr>
       <w:pBdr/>
@@ -32051,10 +32276,10 @@
       <w:color w:val="272727" w:themeColor="text1" w:themeTint="D8"/>
     </w:rPr>
   </w:style>
-  <w:style w:type="character" w:styleId="158">
+  <w:style w:type="character" w:styleId="892">
     <w:name w:val="Heading 9 Char"/>
-    <w:basedOn w:val="765"/>
-    <w:link w:val="764"/>
+    <w:basedOn w:val="928"/>
+    <w:link w:val="927"/>
     <w:uiPriority w:val="9"/>
     <w:pPr>
       <w:pBdr/>
@@ -32068,10 +32293,10 @@
       <w:color w:val="272727" w:themeColor="text1" w:themeTint="D8"/>
     </w:rPr>
   </w:style>
-  <w:style w:type="character" w:styleId="160">
+  <w:style w:type="character" w:styleId="893">
     <w:name w:val="Title Char"/>
-    <w:basedOn w:val="765"/>
-    <w:link w:val="777"/>
+    <w:basedOn w:val="928"/>
+    <w:link w:val="940"/>
     <w:uiPriority w:val="10"/>
     <w:pPr>
       <w:pBdr/>
@@ -32085,10 +32310,10 @@
       <w:szCs w:val="56"/>
     </w:rPr>
   </w:style>
-  <w:style w:type="character" w:styleId="162">
+  <w:style w:type="character" w:styleId="894">
     <w:name w:val="Subtitle Char"/>
-    <w:basedOn w:val="765"/>
-    <w:link w:val="786"/>
+    <w:basedOn w:val="928"/>
+    <w:link w:val="949"/>
     <w:uiPriority w:val="11"/>
     <w:pPr>
       <w:pBdr/>
@@ -32102,10 +32327,10 @@
       <w:szCs w:val="28"/>
     </w:rPr>
   </w:style>
-  <w:style w:type="character" w:styleId="164">
+  <w:style w:type="character" w:styleId="895">
     <w:name w:val="Quote Char"/>
-    <w:basedOn w:val="765"/>
-    <w:link w:val="791"/>
+    <w:basedOn w:val="928"/>
+    <w:link w:val="954"/>
     <w:uiPriority w:val="29"/>
     <w:pPr>
       <w:pBdr/>
@@ -32118,10 +32343,10 @@
       <w:color w:val="404040" w:themeColor="text1" w:themeTint="BF"/>
     </w:rPr>
   </w:style>
-  <w:style w:type="character" w:styleId="168">
+  <w:style w:type="character" w:styleId="896">
     <w:name w:val="Intense Quote Char"/>
-    <w:basedOn w:val="765"/>
-    <w:link w:val="793"/>
+    <w:basedOn w:val="928"/>
+    <w:link w:val="956"/>
     <w:uiPriority w:val="30"/>
     <w:pPr>
       <w:pBdr/>
@@ -32134,10 +32359,10 @@
       <w:color w:val="0f4761" w:themeColor="accent1" w:themeShade="BF"/>
     </w:rPr>
   </w:style>
-  <w:style w:type="character" w:styleId="177">
+  <w:style w:type="character" w:styleId="897">
     <w:name w:val="Header Char"/>
-    <w:basedOn w:val="765"/>
-    <w:link w:val="781"/>
+    <w:basedOn w:val="928"/>
+    <w:link w:val="944"/>
     <w:uiPriority w:val="99"/>
     <w:pPr>
       <w:pBdr/>
@@ -32145,10 +32370,10 @@
       <w:ind/>
     </w:pPr>
   </w:style>
-  <w:style w:type="character" w:styleId="179">
+  <w:style w:type="character" w:styleId="898">
     <w:name w:val="Footer Char"/>
-    <w:basedOn w:val="765"/>
-    <w:link w:val="783"/>
+    <w:basedOn w:val="928"/>
+    <w:link w:val="946"/>
     <w:uiPriority w:val="99"/>
     <w:pPr>
       <w:pBdr/>
@@ -32156,10 +32381,10 @@
       <w:ind/>
     </w:pPr>
   </w:style>
-  <w:style w:type="paragraph" w:styleId="181">
+  <w:style w:type="paragraph" w:styleId="899">
     <w:name w:val="footnote text"/>
-    <w:basedOn w:val="755"/>
-    <w:link w:val="182"/>
+    <w:basedOn w:val="918"/>
+    <w:link w:val="900"/>
     <w:uiPriority w:val="99"/>
     <w:semiHidden/>
     <w:unhideWhenUsed/>
@@ -32173,10 +32398,10 @@
       <w:szCs w:val="20"/>
     </w:rPr>
   </w:style>
-  <w:style w:type="character" w:styleId="182">
+  <w:style w:type="character" w:styleId="900">
     <w:name w:val="Footnote Text Char"/>
-    <w:basedOn w:val="765"/>
-    <w:link w:val="181"/>
+    <w:basedOn w:val="928"/>
+    <w:link w:val="899"/>
     <w:uiPriority w:val="99"/>
     <w:semiHidden/>
     <w:pPr>
@@ -32189,9 +32414,9 @@
       <w:szCs w:val="20"/>
     </w:rPr>
   </w:style>
-  <w:style w:type="character" w:styleId="183">
+  <w:style w:type="character" w:styleId="901">
     <w:name w:val="footnote reference"/>
-    <w:basedOn w:val="765"/>
+    <w:basedOn w:val="928"/>
     <w:uiPriority w:val="99"/>
     <w:semiHidden/>
     <w:unhideWhenUsed/>
@@ -32204,10 +32429,10 @@
       <w:vertAlign w:val="superscript"/>
     </w:rPr>
   </w:style>
-  <w:style w:type="paragraph" w:styleId="184">
+  <w:style w:type="paragraph" w:styleId="902">
     <w:name w:val="endnote text"/>
-    <w:basedOn w:val="755"/>
-    <w:link w:val="185"/>
+    <w:basedOn w:val="918"/>
+    <w:link w:val="903"/>
     <w:uiPriority w:val="99"/>
     <w:semiHidden/>
     <w:unhideWhenUsed/>
@@ -32221,10 +32446,10 @@
       <w:szCs w:val="20"/>
     </w:rPr>
   </w:style>
-  <w:style w:type="character" w:styleId="185">
+  <w:style w:type="character" w:styleId="903">
     <w:name w:val="Endnote Text Char"/>
-    <w:basedOn w:val="765"/>
-    <w:link w:val="184"/>
+    <w:basedOn w:val="928"/>
+    <w:link w:val="902"/>
     <w:uiPriority w:val="99"/>
     <w:semiHidden/>
     <w:pPr>
@@ -32237,9 +32462,9 @@
       <w:szCs w:val="20"/>
     </w:rPr>
   </w:style>
-  <w:style w:type="character" w:styleId="186">
+  <w:style w:type="character" w:styleId="904">
     <w:name w:val="endnote reference"/>
-    <w:basedOn w:val="765"/>
+    <w:basedOn w:val="928"/>
     <w:uiPriority w:val="99"/>
     <w:semiHidden/>
     <w:unhideWhenUsed/>
@@ -32252,9 +32477,9 @@
       <w:vertAlign w:val="superscript"/>
     </w:rPr>
   </w:style>
-  <w:style w:type="character" w:styleId="187">
+  <w:style w:type="character" w:styleId="905">
     <w:name w:val="Hyperlink"/>
-    <w:basedOn w:val="765"/>
+    <w:basedOn w:val="928"/>
     <w:uiPriority w:val="99"/>
     <w:unhideWhenUsed/>
     <w:pPr>
@@ -32267,9 +32492,9 @@
       <w:u w:val="single"/>
     </w:rPr>
   </w:style>
-  <w:style w:type="character" w:styleId="188">
+  <w:style w:type="character" w:styleId="906">
     <w:name w:val="FollowedHyperlink"/>
-    <w:basedOn w:val="765"/>
+    <w:basedOn w:val="928"/>
     <w:uiPriority w:val="99"/>
     <w:semiHidden/>
     <w:unhideWhenUsed/>
@@ -32283,10 +32508,10 @@
       <w:u w:val="single"/>
     </w:rPr>
   </w:style>
-  <w:style w:type="paragraph" w:styleId="189">
+  <w:style w:type="paragraph" w:styleId="907">
     <w:name w:val="toc 1"/>
-    <w:basedOn w:val="755"/>
-    <w:next w:val="755"/>
+    <w:basedOn w:val="918"/>
+    <w:next w:val="918"/>
     <w:uiPriority w:val="39"/>
     <w:unhideWhenUsed/>
     <w:pPr>
@@ -32295,10 +32520,10 @@
       <w:ind/>
     </w:pPr>
   </w:style>
-  <w:style w:type="paragraph" w:styleId="190">
+  <w:style w:type="paragraph" w:styleId="908">
     <w:name w:val="toc 2"/>
-    <w:basedOn w:val="755"/>
-    <w:next w:val="755"/>
+    <w:basedOn w:val="918"/>
+    <w:next w:val="918"/>
     <w:uiPriority w:val="39"/>
     <w:unhideWhenUsed/>
     <w:pPr>
@@ -32307,10 +32532,10 @@
       <w:ind w:left="220"/>
     </w:pPr>
   </w:style>
-  <w:style w:type="paragraph" w:styleId="191">
+  <w:style w:type="paragraph" w:styleId="909">
     <w:name w:val="toc 3"/>
-    <w:basedOn w:val="755"/>
-    <w:next w:val="755"/>
+    <w:basedOn w:val="918"/>
+    <w:next w:val="918"/>
     <w:uiPriority w:val="39"/>
     <w:unhideWhenUsed/>
     <w:pPr>
@@ -32319,10 +32544,10 @@
       <w:ind w:left="440"/>
     </w:pPr>
   </w:style>
-  <w:style w:type="paragraph" w:styleId="192">
+  <w:style w:type="paragraph" w:styleId="910">
     <w:name w:val="toc 4"/>
-    <w:basedOn w:val="755"/>
-    <w:next w:val="755"/>
+    <w:basedOn w:val="918"/>
+    <w:next w:val="918"/>
     <w:uiPriority w:val="39"/>
     <w:unhideWhenUsed/>
     <w:pPr>
@@ -32331,10 +32556,10 @@
       <w:ind w:left="660"/>
     </w:pPr>
   </w:style>
-  <w:style w:type="paragraph" w:styleId="193">
+  <w:style w:type="paragraph" w:styleId="911">
     <w:name w:val="toc 5"/>
-    <w:basedOn w:val="755"/>
-    <w:next w:val="755"/>
+    <w:basedOn w:val="918"/>
+    <w:next w:val="918"/>
     <w:uiPriority w:val="39"/>
     <w:unhideWhenUsed/>
     <w:pPr>
@@ -32343,10 +32568,10 @@
       <w:ind w:left="880"/>
     </w:pPr>
   </w:style>
-  <w:style w:type="paragraph" w:styleId="194">
+  <w:style w:type="paragraph" w:styleId="912">
     <w:name w:val="toc 6"/>
-    <w:basedOn w:val="755"/>
-    <w:next w:val="755"/>
+    <w:basedOn w:val="918"/>
+    <w:next w:val="918"/>
     <w:uiPriority w:val="39"/>
     <w:unhideWhenUsed/>
     <w:pPr>
@@ -32355,10 +32580,10 @@
       <w:ind w:left="1100"/>
     </w:pPr>
   </w:style>
-  <w:style w:type="paragraph" w:styleId="195">
+  <w:style w:type="paragraph" w:styleId="913">
     <w:name w:val="toc 7"/>
-    <w:basedOn w:val="755"/>
-    <w:next w:val="755"/>
+    <w:basedOn w:val="918"/>
+    <w:next w:val="918"/>
     <w:uiPriority w:val="39"/>
     <w:unhideWhenUsed/>
     <w:pPr>
@@ -32367,10 +32592,10 @@
       <w:ind w:left="1320"/>
     </w:pPr>
   </w:style>
-  <w:style w:type="paragraph" w:styleId="196">
+  <w:style w:type="paragraph" w:styleId="914">
     <w:name w:val="toc 8"/>
-    <w:basedOn w:val="755"/>
-    <w:next w:val="755"/>
+    <w:basedOn w:val="918"/>
+    <w:next w:val="918"/>
     <w:uiPriority w:val="39"/>
     <w:unhideWhenUsed/>
     <w:pPr>
@@ -32379,10 +32604,10 @@
       <w:ind w:left="1540"/>
     </w:pPr>
   </w:style>
-  <w:style w:type="paragraph" w:styleId="197">
+  <w:style w:type="paragraph" w:styleId="915">
     <w:name w:val="toc 9"/>
-    <w:basedOn w:val="755"/>
-    <w:next w:val="755"/>
+    <w:basedOn w:val="918"/>
+    <w:next w:val="918"/>
     <w:uiPriority w:val="39"/>
     <w:unhideWhenUsed/>
     <w:pPr>
@@ -32391,9 +32616,9 @@
       <w:ind w:left="1760"/>
     </w:pPr>
   </w:style>
-  <w:style w:type="character" w:styleId="198">
+  <w:style w:type="character" w:styleId="916">
     <w:name w:val="Placeholder Text"/>
-    <w:basedOn w:val="765"/>
+    <w:basedOn w:val="928"/>
     <w:uiPriority w:val="99"/>
     <w:semiHidden/>
     <w:pPr>
@@ -32405,10 +32630,10 @@
       <w:color w:val="666666"/>
     </w:rPr>
   </w:style>
-  <w:style w:type="paragraph" w:styleId="209">
+  <w:style w:type="paragraph" w:styleId="917">
     <w:name w:val="table of figures"/>
-    <w:basedOn w:val="755"/>
-    <w:next w:val="755"/>
+    <w:basedOn w:val="918"/>
+    <w:next w:val="918"/>
     <w:uiPriority w:val="99"/>
     <w:unhideWhenUsed/>
     <w:pPr>
@@ -32417,7 +32642,7 @@
       <w:ind/>
     </w:pPr>
   </w:style>
-  <w:style w:type="paragraph" w:styleId="755" w:default="1">
+  <w:style w:type="paragraph" w:styleId="918" w:default="1">
     <w:name w:val="Normal"/>
     <w:qFormat/>
     <w:pPr>
@@ -32426,11 +32651,11 @@
       <w:ind/>
     </w:pPr>
   </w:style>
-  <w:style w:type="paragraph" w:styleId="756">
+  <w:style w:type="paragraph" w:styleId="919">
     <w:name w:val="Heading 1"/>
-    <w:basedOn w:val="755"/>
-    <w:next w:val="755"/>
-    <w:link w:val="768"/>
+    <w:basedOn w:val="918"/>
+    <w:next w:val="918"/>
+    <w:link w:val="931"/>
     <w:uiPriority w:val="9"/>
     <w:qFormat/>
     <w:pPr>
@@ -32450,11 +32675,11 @@
       <w:szCs w:val="28"/>
     </w:rPr>
   </w:style>
-  <w:style w:type="paragraph" w:styleId="757">
+  <w:style w:type="paragraph" w:styleId="920">
     <w:name w:val="Heading 2"/>
-    <w:basedOn w:val="755"/>
-    <w:next w:val="755"/>
-    <w:link w:val="769"/>
+    <w:basedOn w:val="918"/>
+    <w:next w:val="918"/>
+    <w:link w:val="932"/>
     <w:uiPriority w:val="9"/>
     <w:unhideWhenUsed/>
     <w:qFormat/>
@@ -32475,11 +32700,11 @@
       <w:szCs w:val="26"/>
     </w:rPr>
   </w:style>
-  <w:style w:type="paragraph" w:styleId="758">
+  <w:style w:type="paragraph" w:styleId="921">
     <w:name w:val="Heading 3"/>
-    <w:basedOn w:val="755"/>
-    <w:next w:val="755"/>
-    <w:link w:val="770"/>
+    <w:basedOn w:val="918"/>
+    <w:next w:val="918"/>
+    <w:link w:val="933"/>
     <w:uiPriority w:val="9"/>
     <w:unhideWhenUsed/>
     <w:qFormat/>
@@ -32498,11 +32723,11 @@
       <w:color w:val="4f81bd" w:themeColor="accent1"/>
     </w:rPr>
   </w:style>
-  <w:style w:type="paragraph" w:styleId="759">
+  <w:style w:type="paragraph" w:styleId="922">
     <w:name w:val="Heading 4"/>
-    <w:basedOn w:val="755"/>
-    <w:next w:val="755"/>
-    <w:link w:val="771"/>
+    <w:basedOn w:val="918"/>
+    <w:next w:val="918"/>
+    <w:link w:val="934"/>
     <w:uiPriority w:val="9"/>
     <w:semiHidden/>
     <w:unhideWhenUsed/>
@@ -32524,11 +32749,11 @@
       <w:color w:val="4f81bd" w:themeColor="accent1"/>
     </w:rPr>
   </w:style>
-  <w:style w:type="paragraph" w:styleId="760">
+  <w:style w:type="paragraph" w:styleId="923">
     <w:name w:val="Heading 5"/>
-    <w:basedOn w:val="755"/>
-    <w:next w:val="755"/>
-    <w:link w:val="772"/>
+    <w:basedOn w:val="918"/>
+    <w:next w:val="918"/>
+    <w:link w:val="935"/>
     <w:uiPriority w:val="9"/>
     <w:semiHidden/>
     <w:unhideWhenUsed/>
@@ -32546,11 +32771,11 @@
       <w:color w:val="243f60" w:themeColor="accent1" w:themeShade="7F"/>
     </w:rPr>
   </w:style>
-  <w:style w:type="paragraph" w:styleId="761">
+  <w:style w:type="paragraph" w:styleId="924">
     <w:name w:val="Heading 6"/>
-    <w:basedOn w:val="755"/>
-    <w:next w:val="755"/>
-    <w:link w:val="773"/>
+    <w:basedOn w:val="918"/>
+    <w:next w:val="918"/>
+    <w:link w:val="936"/>
     <w:uiPriority w:val="9"/>
     <w:semiHidden/>
     <w:unhideWhenUsed/>
@@ -32570,11 +32795,11 @@
       <w:color w:val="243f60" w:themeColor="accent1" w:themeShade="7F"/>
     </w:rPr>
   </w:style>
-  <w:style w:type="paragraph" w:styleId="762">
+  <w:style w:type="paragraph" w:styleId="925">
     <w:name w:val="Heading 7"/>
-    <w:basedOn w:val="755"/>
-    <w:next w:val="755"/>
-    <w:link w:val="774"/>
+    <w:basedOn w:val="918"/>
+    <w:next w:val="918"/>
+    <w:link w:val="937"/>
     <w:uiPriority w:val="9"/>
     <w:semiHidden/>
     <w:unhideWhenUsed/>
@@ -32594,11 +32819,11 @@
       <w:color w:val="404040" w:themeColor="text1" w:themeTint="BF"/>
     </w:rPr>
   </w:style>
-  <w:style w:type="paragraph" w:styleId="763">
+  <w:style w:type="paragraph" w:styleId="926">
     <w:name w:val="Heading 8"/>
-    <w:basedOn w:val="755"/>
-    <w:next w:val="755"/>
-    <w:link w:val="775"/>
+    <w:basedOn w:val="918"/>
+    <w:next w:val="918"/>
+    <w:link w:val="938"/>
     <w:uiPriority w:val="9"/>
     <w:semiHidden/>
     <w:unhideWhenUsed/>
@@ -32618,11 +32843,11 @@
       <w:szCs w:val="20"/>
     </w:rPr>
   </w:style>
-  <w:style w:type="paragraph" w:styleId="764">
+  <w:style w:type="paragraph" w:styleId="927">
     <w:name w:val="Heading 9"/>
-    <w:basedOn w:val="755"/>
-    <w:next w:val="755"/>
-    <w:link w:val="776"/>
+    <w:basedOn w:val="918"/>
+    <w:next w:val="918"/>
+    <w:link w:val="939"/>
     <w:uiPriority w:val="9"/>
     <w:semiHidden/>
     <w:unhideWhenUsed/>
@@ -32644,7 +32869,7 @@
       <w:szCs w:val="20"/>
     </w:rPr>
   </w:style>
-  <w:style w:type="character" w:styleId="765" w:default="1">
+  <w:style w:type="character" w:styleId="928" w:default="1">
     <w:name w:val="Default Paragraph Font"/>
     <w:uiPriority w:val="1"/>
     <w:semiHidden/>
@@ -32655,7 +32880,7 @@
       <w:ind/>
     </w:pPr>
   </w:style>
-  <w:style w:type="table" w:styleId="766" w:default="1">
+  <w:style w:type="table" w:styleId="929" w:default="1">
     <w:name w:val="Normal Table"/>
     <w:uiPriority w:val="99"/>
     <w:semiHidden/>
@@ -32848,7 +33073,7 @@
       </w:tcPr>
     </w:tblStylePr>
   </w:style>
-  <w:style w:type="numbering" w:styleId="767" w:default="1">
+  <w:style w:type="numbering" w:styleId="930" w:default="1">
     <w:name w:val="No List"/>
     <w:uiPriority w:val="99"/>
     <w:semiHidden/>
@@ -32859,10 +33084,10 @@
       <w:ind/>
     </w:pPr>
   </w:style>
-  <w:style w:type="character" w:styleId="768" w:customStyle="1">
+  <w:style w:type="character" w:styleId="931" w:customStyle="1">
     <w:name w:val="Titre 1 Car"/>
-    <w:basedOn w:val="765"/>
-    <w:link w:val="756"/>
+    <w:basedOn w:val="928"/>
+    <w:link w:val="919"/>
     <w:uiPriority w:val="9"/>
     <w:pPr>
       <w:pBdr/>
@@ -32878,10 +33103,10 @@
       <w:szCs w:val="28"/>
     </w:rPr>
   </w:style>
-  <w:style w:type="character" w:styleId="769" w:customStyle="1">
+  <w:style w:type="character" w:styleId="932" w:customStyle="1">
     <w:name w:val="Titre 2 Car"/>
-    <w:basedOn w:val="765"/>
-    <w:link w:val="757"/>
+    <w:basedOn w:val="928"/>
+    <w:link w:val="920"/>
     <w:uiPriority w:val="9"/>
     <w:pPr>
       <w:pBdr/>
@@ -32897,10 +33122,10 @@
       <w:szCs w:val="26"/>
     </w:rPr>
   </w:style>
-  <w:style w:type="character" w:styleId="770" w:customStyle="1">
+  <w:style w:type="character" w:styleId="933" w:customStyle="1">
     <w:name w:val="Titre 3 Car"/>
-    <w:basedOn w:val="765"/>
-    <w:link w:val="758"/>
+    <w:basedOn w:val="928"/>
+    <w:link w:val="921"/>
     <w:uiPriority w:val="9"/>
     <w:pPr>
       <w:pBdr/>
@@ -32914,10 +33139,10 @@
       <w:color w:val="4f81bd" w:themeColor="accent1"/>
     </w:rPr>
   </w:style>
-  <w:style w:type="character" w:styleId="771" w:customStyle="1">
+  <w:style w:type="character" w:styleId="934" w:customStyle="1">
     <w:name w:val="Titre 4 Car"/>
-    <w:basedOn w:val="765"/>
-    <w:link w:val="759"/>
+    <w:basedOn w:val="928"/>
+    <w:link w:val="922"/>
     <w:uiPriority w:val="9"/>
     <w:pPr>
       <w:pBdr/>
@@ -32933,10 +33158,10 @@
       <w:color w:val="4f81bd" w:themeColor="accent1"/>
     </w:rPr>
   </w:style>
-  <w:style w:type="character" w:styleId="772" w:customStyle="1">
+  <w:style w:type="character" w:styleId="935" w:customStyle="1">
     <w:name w:val="Titre 5 Car"/>
-    <w:basedOn w:val="765"/>
-    <w:link w:val="760"/>
+    <w:basedOn w:val="928"/>
+    <w:link w:val="923"/>
     <w:uiPriority w:val="9"/>
     <w:pPr>
       <w:pBdr/>
@@ -32948,10 +33173,10 @@
       <w:color w:val="243f60" w:themeColor="accent1" w:themeShade="7F"/>
     </w:rPr>
   </w:style>
-  <w:style w:type="character" w:styleId="773" w:customStyle="1">
+  <w:style w:type="character" w:styleId="936" w:customStyle="1">
     <w:name w:val="Titre 6 Car"/>
-    <w:basedOn w:val="765"/>
-    <w:link w:val="761"/>
+    <w:basedOn w:val="928"/>
+    <w:link w:val="924"/>
     <w:uiPriority w:val="9"/>
     <w:pPr>
       <w:pBdr/>
@@ -32965,10 +33190,10 @@
       <w:color w:val="243f60" w:themeColor="accent1" w:themeShade="7F"/>
     </w:rPr>
   </w:style>
-  <w:style w:type="character" w:styleId="774" w:customStyle="1">
+  <w:style w:type="character" w:styleId="937" w:customStyle="1">
     <w:name w:val="Titre 7 Car"/>
-    <w:basedOn w:val="765"/>
-    <w:link w:val="762"/>
+    <w:basedOn w:val="928"/>
+    <w:link w:val="925"/>
     <w:uiPriority w:val="9"/>
     <w:pPr>
       <w:pBdr/>
@@ -32982,10 +33207,10 @@
       <w:color w:val="404040" w:themeColor="text1" w:themeTint="BF"/>
     </w:rPr>
   </w:style>
-  <w:style w:type="character" w:styleId="775" w:customStyle="1">
+  <w:style w:type="character" w:styleId="938" w:customStyle="1">
     <w:name w:val="Titre 8 Car"/>
-    <w:basedOn w:val="765"/>
-    <w:link w:val="763"/>
+    <w:basedOn w:val="928"/>
+    <w:link w:val="926"/>
     <w:uiPriority w:val="9"/>
     <w:pPr>
       <w:pBdr/>
@@ -32999,10 +33224,10 @@
       <w:szCs w:val="20"/>
     </w:rPr>
   </w:style>
-  <w:style w:type="character" w:styleId="776" w:customStyle="1">
+  <w:style w:type="character" w:styleId="939" w:customStyle="1">
     <w:name w:val="Titre 9 Car"/>
-    <w:basedOn w:val="765"/>
-    <w:link w:val="764"/>
+    <w:basedOn w:val="928"/>
+    <w:link w:val="927"/>
     <w:uiPriority w:val="9"/>
     <w:pPr>
       <w:pBdr/>
@@ -33018,11 +33243,11 @@
       <w:szCs w:val="20"/>
     </w:rPr>
   </w:style>
-  <w:style w:type="paragraph" w:styleId="777">
+  <w:style w:type="paragraph" w:styleId="940">
     <w:name w:val="Title"/>
-    <w:basedOn w:val="755"/>
-    <w:next w:val="755"/>
-    <w:link w:val="778"/>
+    <w:basedOn w:val="918"/>
+    <w:next w:val="918"/>
+    <w:link w:val="941"/>
     <w:uiPriority w:val="10"/>
     <w:qFormat/>
     <w:pPr>
@@ -33041,10 +33266,10 @@
       <w:szCs w:val="52"/>
     </w:rPr>
   </w:style>
-  <w:style w:type="character" w:styleId="778" w:customStyle="1">
+  <w:style w:type="character" w:styleId="941" w:customStyle="1">
     <w:name w:val="Titre Car"/>
-    <w:basedOn w:val="765"/>
-    <w:link w:val="777"/>
+    <w:basedOn w:val="928"/>
+    <w:link w:val="940"/>
     <w:uiPriority w:val="10"/>
     <w:pPr>
       <w:pBdr/>
@@ -33059,9 +33284,9 @@
       <w:szCs w:val="52"/>
     </w:rPr>
   </w:style>
-  <w:style w:type="paragraph" w:styleId="779">
+  <w:style w:type="paragraph" w:styleId="942">
     <w:name w:val="List Paragraph"/>
-    <w:basedOn w:val="755"/>
+    <w:basedOn w:val="918"/>
     <w:uiPriority w:val="34"/>
     <w:qFormat/>
     <w:pPr>
@@ -33071,9 +33296,9 @@
       <w:contextualSpacing w:val="true"/>
     </w:pPr>
   </w:style>
-  <w:style w:type="character" w:styleId="780">
+  <w:style w:type="character" w:styleId="943">
     <w:name w:val="Subtle Reference"/>
-    <w:basedOn w:val="765"/>
+    <w:basedOn w:val="928"/>
     <w:uiPriority w:val="31"/>
     <w:qFormat/>
     <w:pPr>
@@ -33087,10 +33312,10 @@
       <w:u w:val="single"/>
     </w:rPr>
   </w:style>
-  <w:style w:type="paragraph" w:styleId="781">
+  <w:style w:type="paragraph" w:styleId="944">
     <w:name w:val="Header"/>
-    <w:basedOn w:val="755"/>
-    <w:link w:val="782"/>
+    <w:basedOn w:val="918"/>
+    <w:link w:val="945"/>
     <w:uiPriority w:val="99"/>
     <w:unhideWhenUsed/>
     <w:pPr>
@@ -33103,10 +33328,10 @@
       <w:ind/>
     </w:pPr>
   </w:style>
-  <w:style w:type="character" w:styleId="782" w:customStyle="1">
+  <w:style w:type="character" w:styleId="945" w:customStyle="1">
     <w:name w:val="En-tête Car"/>
-    <w:basedOn w:val="765"/>
-    <w:link w:val="781"/>
+    <w:basedOn w:val="928"/>
+    <w:link w:val="944"/>
     <w:uiPriority w:val="99"/>
     <w:pPr>
       <w:pBdr/>
@@ -33118,10 +33343,10 @@
       <w:szCs w:val="24"/>
     </w:rPr>
   </w:style>
-  <w:style w:type="paragraph" w:styleId="783">
+  <w:style w:type="paragraph" w:styleId="946">
     <w:name w:val="Footer"/>
-    <w:basedOn w:val="755"/>
-    <w:link w:val="784"/>
+    <w:basedOn w:val="918"/>
+    <w:link w:val="947"/>
     <w:uiPriority w:val="99"/>
     <w:unhideWhenUsed/>
     <w:pPr>
@@ -33134,10 +33359,10 @@
       <w:ind/>
     </w:pPr>
   </w:style>
-  <w:style w:type="character" w:styleId="784" w:customStyle="1">
+  <w:style w:type="character" w:styleId="947" w:customStyle="1">
     <w:name w:val="Pied de page Car"/>
-    <w:basedOn w:val="765"/>
-    <w:link w:val="783"/>
+    <w:basedOn w:val="928"/>
+    <w:link w:val="946"/>
     <w:uiPriority w:val="99"/>
     <w:pPr>
       <w:pBdr/>
@@ -33149,10 +33374,10 @@
       <w:szCs w:val="24"/>
     </w:rPr>
   </w:style>
-  <w:style w:type="paragraph" w:styleId="785">
+  <w:style w:type="paragraph" w:styleId="948">
     <w:name w:val="Caption"/>
-    <w:basedOn w:val="755"/>
-    <w:next w:val="755"/>
+    <w:basedOn w:val="918"/>
+    <w:next w:val="918"/>
     <w:uiPriority w:val="35"/>
     <w:semiHidden/>
     <w:unhideWhenUsed/>
@@ -33170,11 +33395,11 @@
       <w:szCs w:val="18"/>
     </w:rPr>
   </w:style>
-  <w:style w:type="paragraph" w:styleId="786">
+  <w:style w:type="paragraph" w:styleId="949">
     <w:name w:val="Subtitle"/>
-    <w:basedOn w:val="755"/>
-    <w:next w:val="755"/>
-    <w:link w:val="787"/>
+    <w:basedOn w:val="918"/>
+    <w:next w:val="918"/>
+    <w:link w:val="950"/>
     <w:uiPriority w:val="11"/>
     <w:qFormat/>
     <w:pPr>
@@ -33195,10 +33420,10 @@
       <w:szCs w:val="24"/>
     </w:rPr>
   </w:style>
-  <w:style w:type="character" w:styleId="787" w:customStyle="1">
+  <w:style w:type="character" w:styleId="950" w:customStyle="1">
     <w:name w:val="Sous-titre Car"/>
-    <w:basedOn w:val="765"/>
-    <w:link w:val="786"/>
+    <w:basedOn w:val="928"/>
+    <w:link w:val="949"/>
     <w:uiPriority w:val="11"/>
     <w:pPr>
       <w:pBdr/>
@@ -33215,9 +33440,9 @@
       <w:szCs w:val="24"/>
     </w:rPr>
   </w:style>
-  <w:style w:type="character" w:styleId="788">
+  <w:style w:type="character" w:styleId="951">
     <w:name w:val="Strong"/>
-    <w:basedOn w:val="765"/>
+    <w:basedOn w:val="928"/>
     <w:uiPriority w:val="22"/>
     <w:qFormat/>
     <w:pPr>
@@ -33230,9 +33455,9 @@
       <w:bCs/>
     </w:rPr>
   </w:style>
-  <w:style w:type="character" w:styleId="789">
+  <w:style w:type="character" w:styleId="952">
     <w:name w:val="Emphasis"/>
-    <w:basedOn w:val="765"/>
+    <w:basedOn w:val="928"/>
     <w:uiPriority w:val="20"/>
     <w:qFormat/>
     <w:pPr>
@@ -33245,7 +33470,7 @@
       <w:iCs/>
     </w:rPr>
   </w:style>
-  <w:style w:type="paragraph" w:styleId="790">
+  <w:style w:type="paragraph" w:styleId="953">
     <w:name w:val="No Spacing"/>
     <w:uiPriority w:val="1"/>
     <w:qFormat/>
@@ -33255,11 +33480,11 @@
       <w:ind/>
     </w:pPr>
   </w:style>
-  <w:style w:type="paragraph" w:styleId="791">
+  <w:style w:type="paragraph" w:styleId="954">
     <w:name w:val="Quote"/>
-    <w:basedOn w:val="755"/>
-    <w:next w:val="755"/>
-    <w:link w:val="792"/>
+    <w:basedOn w:val="918"/>
+    <w:next w:val="918"/>
+    <w:link w:val="955"/>
     <w:uiPriority w:val="29"/>
     <w:qFormat/>
     <w:pPr>
@@ -33273,10 +33498,10 @@
       <w:color w:val="000000" w:themeColor="text1"/>
     </w:rPr>
   </w:style>
-  <w:style w:type="character" w:styleId="792" w:customStyle="1">
+  <w:style w:type="character" w:styleId="955" w:customStyle="1">
     <w:name w:val="Citation Car"/>
-    <w:basedOn w:val="765"/>
-    <w:link w:val="791"/>
+    <w:basedOn w:val="928"/>
+    <w:link w:val="954"/>
     <w:uiPriority w:val="29"/>
     <w:pPr>
       <w:pBdr/>
@@ -33289,11 +33514,11 @@
       <w:color w:val="000000" w:themeColor="text1"/>
     </w:rPr>
   </w:style>
-  <w:style w:type="paragraph" w:styleId="793">
+  <w:style w:type="paragraph" w:styleId="956">
     <w:name w:val="Intense Quote"/>
-    <w:basedOn w:val="755"/>
-    <w:next w:val="755"/>
-    <w:link w:val="794"/>
+    <w:basedOn w:val="918"/>
+    <w:next w:val="918"/>
+    <w:link w:val="957"/>
     <w:uiPriority w:val="30"/>
     <w:qFormat/>
     <w:pPr>
@@ -33311,10 +33536,10 @@
       <w:color w:val="4f81bd" w:themeColor="accent1"/>
     </w:rPr>
   </w:style>
-  <w:style w:type="character" w:styleId="794" w:customStyle="1">
+  <w:style w:type="character" w:styleId="957" w:customStyle="1">
     <w:name w:val="Citation intense Car"/>
-    <w:basedOn w:val="765"/>
-    <w:link w:val="793"/>
+    <w:basedOn w:val="928"/>
+    <w:link w:val="956"/>
     <w:uiPriority w:val="30"/>
     <w:pPr>
       <w:pBdr/>
@@ -33329,9 +33554,9 @@
       <w:color w:val="4f81bd" w:themeColor="accent1"/>
     </w:rPr>
   </w:style>
-  <w:style w:type="character" w:styleId="795">
+  <w:style w:type="character" w:styleId="958">
     <w:name w:val="Subtle Emphasis"/>
-    <w:basedOn w:val="765"/>
+    <w:basedOn w:val="928"/>
     <w:uiPriority w:val="19"/>
     <w:qFormat/>
     <w:pPr>
@@ -33345,9 +33570,9 @@
       <w:color w:val="808080" w:themeColor="text1" w:themeTint="7F"/>
     </w:rPr>
   </w:style>
-  <w:style w:type="character" w:styleId="796">
+  <w:style w:type="character" w:styleId="959">
     <w:name w:val="Intense Emphasis"/>
-    <w:basedOn w:val="765"/>
+    <w:basedOn w:val="928"/>
     <w:uiPriority w:val="21"/>
     <w:qFormat/>
     <w:pPr>
@@ -33363,9 +33588,9 @@
       <w:color w:val="4f81bd" w:themeColor="accent1"/>
     </w:rPr>
   </w:style>
-  <w:style w:type="character" w:styleId="797">
+  <w:style w:type="character" w:styleId="960">
     <w:name w:val="Intense Reference"/>
-    <w:basedOn w:val="765"/>
+    <w:basedOn w:val="928"/>
     <w:uiPriority w:val="32"/>
     <w:qFormat/>
     <w:pPr>
@@ -33382,9 +33607,9 @@
       <w:u w:val="single"/>
     </w:rPr>
   </w:style>
-  <w:style w:type="character" w:styleId="798">
+  <w:style w:type="character" w:styleId="961">
     <w:name w:val="Book Title"/>
-    <w:basedOn w:val="765"/>
+    <w:basedOn w:val="928"/>
     <w:uiPriority w:val="33"/>
     <w:qFormat/>
     <w:pPr>
@@ -33399,10 +33624,10 @@
       <w:spacing w:val="5"/>
     </w:rPr>
   </w:style>
-  <w:style w:type="paragraph" w:styleId="799">
+  <w:style w:type="paragraph" w:styleId="962">
     <w:name w:val="TOC Heading"/>
-    <w:basedOn w:val="756"/>
-    <w:next w:val="755"/>
+    <w:basedOn w:val="919"/>
+    <w:next w:val="918"/>
     <w:uiPriority w:val="39"/>
     <w:semiHidden/>
     <w:unhideWhenUsed/>
@@ -33414,10 +33639,10 @@
       <w:outlineLvl w:val="9"/>
     </w:pPr>
   </w:style>
-  <w:style w:type="paragraph" w:styleId="800">
+  <w:style w:type="paragraph" w:styleId="963">
     <w:name w:val="Balloon Text"/>
-    <w:basedOn w:val="755"/>
-    <w:link w:val="801"/>
+    <w:basedOn w:val="918"/>
+    <w:link w:val="964"/>
     <w:uiPriority w:val="99"/>
     <w:semiHidden/>
     <w:unhideWhenUsed/>
@@ -33432,10 +33657,10 @@
       <w:szCs w:val="16"/>
     </w:rPr>
   </w:style>
-  <w:style w:type="character" w:styleId="801" w:customStyle="1">
+  <w:style w:type="character" w:styleId="964" w:customStyle="1">
     <w:name w:val="Texte de bulles Car"/>
-    <w:basedOn w:val="765"/>
-    <w:link w:val="800"/>
+    <w:basedOn w:val="928"/>
+    <w:link w:val="963"/>
     <w:uiPriority w:val="99"/>
     <w:semiHidden/>
     <w:pPr>
@@ -33449,9 +33674,9 @@
       <w:szCs w:val="16"/>
     </w:rPr>
   </w:style>
-  <w:style w:type="paragraph" w:styleId="802">
+  <w:style w:type="paragraph" w:styleId="965">
     <w:name w:val="Normal (Web)"/>
-    <w:basedOn w:val="755"/>
+    <w:basedOn w:val="918"/>
     <w:uiPriority w:val="99"/>
     <w:semiHidden/>
     <w:unhideWhenUsed/>
@@ -33467,9 +33692,9 @@
       <w:lang w:val="fr-FR" w:eastAsia="fr-FR" w:bidi="ar-SA"/>
     </w:rPr>
   </w:style>
-  <w:style w:type="character" w:styleId="803">
+  <w:style w:type="character" w:styleId="966">
     <w:name w:val="HTML Code"/>
-    <w:basedOn w:val="765"/>
+    <w:basedOn w:val="928"/>
     <w:uiPriority w:val="99"/>
     <w:semiHidden/>
     <w:unhideWhenUsed/>
@@ -33484,9 +33709,9 @@
       <w:szCs w:val="20"/>
     </w:rPr>
   </w:style>
-  <w:style w:type="paragraph" w:styleId="804" w:customStyle="1">
+  <w:style w:type="paragraph" w:styleId="967" w:customStyle="1">
     <w:name w:val="hoveredcourseelement"/>
-    <w:basedOn w:val="755"/>
+    <w:basedOn w:val="918"/>
     <w:pPr>
       <w:pBdr/>
       <w:spacing w:after="100" w:afterAutospacing="1" w:before="100" w:beforeAutospacing="1" w:line="240" w:lineRule="auto"/>
@@ -33727,7 +33952,7 @@
 </file>
 
 <file path=customXml/itemProps1.xml><?xml version="1.0" encoding="utf-8"?>
-<ds:datastoreItem xmlns:ds="http://schemas.openxmlformats.org/officeDocument/2006/customXml" ds:itemID="{9C146052-9BAB-4895-A1E6-627CAF7154C4}">
+<ds:datastoreItem xmlns:ds="http://schemas.openxmlformats.org/officeDocument/2006/customXml" ds:itemID="9c146052-9bab-4895-a1e6-627caf7154c4">
   <ds:schemaRefs>
     <ds:schemaRef ds:uri="http://schemas.openxmlformats.org/officeDocument/2006/bibliography"/>
   </ds:schemaRefs>

</xml_diff>

<commit_message>
Ajout de la page d'inscription et suppression du login (BDD) + correction du code + ajout de vérification dans le routeur
</commit_message>
<xml_diff>
--- a/td16_MVC_inscription.docx
+++ b/td16_MVC_inscription.docx
@@ -834,6 +834,7 @@
           <w:bCs/>
           <w:lang w:val="fr-FR"/>
         </w:rPr>
+        <w:t xml:space="preserve"> [FAIT]</w:t>
       </w:r>
       <w:r>
         <w:rPr>
@@ -1029,6 +1030,122 @@
       </w:r>
       <w:r>
         <w:rPr>
+          <w:b/>
+          <w:bCs/>
+          <w:highlight w:val="none"/>
+          <w:lang w:val="fr-FR"/>
+        </w:rPr>
+      </w:r>
+    </w:p>
+    <w:p>
+      <w:pPr>
+        <w:pBdr/>
+        <w:spacing/>
+        <w:ind/>
+        <w:rPr>
+          <w:b/>
+          <w:bCs/>
+          <w:highlight w:val="none"/>
+          <w:lang w:val="fr-FR"/>
+        </w:rPr>
+      </w:pPr>
+      <w:r>
+        <w:rPr>
+          <w:b/>
+          <w:bCs/>
+          <w:highlight w:val="none"/>
+          <w:lang w:val="fr-FR"/>
+        </w:rPr>
+      </w:r>
+      <w:r>
+        <w:rPr>
+          <w:b/>
+          <w:bCs/>
+          <w:highlight w:val="none"/>
+          <w:lang w:val="fr-FR"/>
+        </w:rPr>
+      </w:r>
+      <w:r>
+        <w:rPr>
+          <w:b/>
+          <w:bCs/>
+          <w:highlight w:val="none"/>
+          <w:lang w:val="fr-FR"/>
+        </w:rPr>
+      </w:r>
+    </w:p>
+    <w:p>
+      <w:pPr>
+        <w:pBdr/>
+        <w:spacing/>
+        <w:ind/>
+        <w:rPr>
+          <w:b/>
+          <w:bCs/>
+          <w:highlight w:val="none"/>
+          <w:lang w:val="fr-FR"/>
+        </w:rPr>
+      </w:pPr>
+      <w:r>
+        <w:rPr>
+          <w:b/>
+          <w:bCs/>
+          <w:highlight w:val="none"/>
+          <w:lang w:val="fr-FR"/>
+        </w:rPr>
+      </w:r>
+      <w:r>
+        <w:rPr>
+          <w:b/>
+          <w:bCs/>
+          <w:highlight w:val="none"/>
+          <w:lang w:val="fr-FR"/>
+        </w:rPr>
+      </w:r>
+      <w:r>
+        <w:rPr>
+          <w:b/>
+          <w:bCs/>
+          <w:highlight w:val="none"/>
+          <w:lang w:val="fr-FR"/>
+        </w:rPr>
+      </w:r>
+    </w:p>
+    <w:p>
+      <w:pPr>
+        <w:pBdr/>
+        <w:spacing/>
+        <w:ind/>
+        <w:rPr>
+          <w:b/>
+          <w:bCs/>
+          <w:highlight w:val="none"/>
+          <w:lang w:val="fr-FR"/>
+        </w:rPr>
+      </w:pPr>
+      <w:r>
+        <w:rPr>
+          <w:b/>
+          <w:bCs/>
+          <w:highlight w:val="none"/>
+          <w:lang w:val="fr-FR" w:bidi="fr-FR"/>
+        </w:rPr>
+        <w:t xml:space="preserve">À peaufiner : Page de login et d’inscription : faire un bouton submit amélioré, mettre le carré gris de fond plus beau, plus grand et au mileu de la page</w:t>
+      </w:r>
+      <w:r>
+        <w:rPr>
+          <w:b/>
+          <w:bCs/>
+          <w:highlight w:val="none"/>
+          <w:lang w:val="fr-FR" w:bidi="fr-FR"/>
+        </w:rPr>
+        <w:t xml:space="preserve">, mettre les petits liens hypertextes de « Vous n’avez pas de compte ? Inscrivez-vous ! » et « Vous avez déjà un compte ? Connectez-vous ! »</w:t>
+      </w:r>
+      <w:r>
+        <w:rPr>
+          <w:b/>
+          <w:bCs/>
+          <w:highlight w:val="none"/>
           <w:lang w:val="fr-FR"/>
         </w:rPr>
       </w:r>

</xml_diff>